<commit_message>
docs: 产品说明书 v1.1 - VPBuddy_产品说明书.docx (update)
</commit_message>
<xml_diff>
--- a/docs/product-spec/VPBuddy_产品说明书.docx
+++ b/docs/product-spec/VPBuddy_产品说明书.docx
@@ -163,7 +163,7 @@
           <w:rFonts w:ascii="微软雅黑" w:eastAsia="微软雅黑" w:hAnsi="微软雅黑"/>
           <w:lang w:eastAsia="zh-CN"/>
         </w:rPr>
-        <w:t>在腾讯会议</w:t>
+        <w:t>在腾讯会议 / 飞书 / 钉钉 / Zoom 中，VPBuddy 后台持续累积(无延迟约束),按 VP 主动调取:</w:t>
       </w:r>
       <w:proofErr w:type="gramEnd"/>
       <w:r>
@@ -171,7 +171,6 @@
           <w:rFonts w:ascii="微软雅黑" w:eastAsia="微软雅黑" w:hAnsi="微软雅黑"/>
           <w:lang w:eastAsia="zh-CN"/>
         </w:rPr>
-        <w:t xml:space="preserve"> / 飞书 / 钉钉 / Zoom 中，</w:t>
       </w:r>
       <w:proofErr w:type="spellStart"/>
       <w:r>
@@ -179,7 +178,6 @@
           <w:rFonts w:ascii="微软雅黑" w:eastAsia="微软雅黑" w:hAnsi="微软雅黑"/>
           <w:lang w:eastAsia="zh-CN"/>
         </w:rPr>
-        <w:t>VPBuddy</w:t>
       </w:r>
       <w:proofErr w:type="spellEnd"/>
       <w:r>
@@ -187,7 +185,6 @@
           <w:rFonts w:ascii="微软雅黑" w:eastAsia="微软雅黑" w:hAnsi="微软雅黑"/>
           <w:lang w:eastAsia="zh-CN"/>
         </w:rPr>
-        <w:t>实时完成：</w:t>
       </w:r>
     </w:p>
     <w:p>
@@ -292,7 +289,7 @@
           <w:rFonts w:ascii="微软雅黑" w:eastAsia="微软雅黑" w:hAnsi="微软雅黑"/>
           <w:lang w:eastAsia="zh-CN"/>
         </w:rPr>
-        <w:t>- 软件交付资产实时生成</w:t>
+        <w:t>- 软件交付资产持续累积(后台),按 VP 主动调取生成</w:t>
       </w:r>
     </w:p>
     <w:p>
@@ -447,7 +444,7 @@
           <w:rFonts w:ascii="微软雅黑" w:eastAsia="微软雅黑" w:hAnsi="微软雅黑"/>
           <w:lang w:eastAsia="zh-CN"/>
         </w:rPr>
-        <w:t>3. 软件需求实时编译引擎（技术本质层）</w:t>
+        <w:t>3. 软件需求持续累积引擎(技术本质层)</w:t>
       </w:r>
     </w:p>
     <w:p>
@@ -757,7 +754,7 @@
           <w:rFonts w:ascii="微软雅黑" w:eastAsia="微软雅黑" w:hAnsi="微软雅黑"/>
           <w:lang w:eastAsia="zh-CN"/>
         </w:rPr>
-        <w:t>会议实时结构化为：</w:t>
+        <w:t>会议持续结构化为(后台,无延迟约束):</w:t>
       </w:r>
     </w:p>
     <w:p>
@@ -972,22 +969,22 @@
         <w:rPr>
           <w:rFonts w:ascii="微软雅黑" w:eastAsia="微软雅黑" w:hAnsi="微软雅黑"/>
         </w:rPr>
-        <w:t>六、交付物实时生成系统</w:t>
-      </w:r>
-    </w:p>
-    <w:p>
-      <w:pPr>
-        <w:rPr>
-          <w:rFonts w:ascii="微软雅黑" w:eastAsia="微软雅黑" w:hAnsi="微软雅黑"/>
-          <w:lang w:eastAsia="zh-CN"/>
-        </w:rPr>
-      </w:pPr>
-      <w:r>
-        <w:rPr>
-          <w:rFonts w:ascii="微软雅黑" w:eastAsia="微软雅黑" w:hAnsi="微软雅黑"/>
-          <w:lang w:eastAsia="zh-CN"/>
-        </w:rPr>
-        <w:t>在会议过程中持续生成：</w:t>
+        <w:t>六、交付物持续累积与按需投屏系统</w:t>
+      </w:r>
+    </w:p>
+    <w:p>
+      <w:pPr>
+        <w:rPr>
+          <w:rFonts w:ascii="微软雅黑" w:eastAsia="微软雅黑" w:hAnsi="微软雅黑"/>
+          <w:lang w:eastAsia="zh-CN"/>
+        </w:rPr>
+      </w:pPr>
+      <w:r>
+        <w:rPr>
+          <w:rFonts w:ascii="微软雅黑" w:eastAsia="微软雅黑" w:hAnsi="微软雅黑"/>
+          <w:lang w:eastAsia="zh-CN"/>
+        </w:rPr>
+        <w:t>在会议过程中持续累积(后台),按 VP 主动调取:</w:t>
       </w:r>
     </w:p>
     <w:p>
@@ -1130,7 +1127,7 @@
           <w:rFonts w:ascii="微软雅黑" w:eastAsia="微软雅黑" w:hAnsi="微软雅黑"/>
           <w:lang w:eastAsia="zh-CN"/>
         </w:rPr>
-        <w:t>核心机制：交付</w:t>
+        <w:t>核心机制:交付物持续累积演化(后台)+ VP 主动调取投屏(1-3min 软目标),而非一次性生成</w:t>
       </w:r>
       <w:proofErr w:type="gramStart"/>
       <w:r>
@@ -1138,7 +1135,6 @@
           <w:rFonts w:ascii="微软雅黑" w:eastAsia="微软雅黑" w:hAnsi="微软雅黑"/>
           <w:lang w:eastAsia="zh-CN"/>
         </w:rPr>
-        <w:t>物持续</w:t>
       </w:r>
       <w:proofErr w:type="gramEnd"/>
       <w:r>
@@ -1146,7 +1142,6 @@
           <w:rFonts w:ascii="微软雅黑" w:eastAsia="微软雅黑" w:hAnsi="微软雅黑"/>
           <w:lang w:eastAsia="zh-CN"/>
         </w:rPr>
-        <w:t>演化，而非一次性生成</w:t>
       </w:r>
     </w:p>
     <w:p>
@@ -1926,7 +1921,7 @@
           <w:rFonts w:ascii="微软雅黑" w:eastAsia="微软雅黑" w:hAnsi="微软雅黑"/>
           <w:lang w:eastAsia="zh-CN"/>
         </w:rPr>
-        <w:t>实时理解</w:t>
+        <w:t>后台持续累积(无延迟约束)</w:t>
       </w:r>
     </w:p>
     <w:p>
@@ -2016,7 +2011,7 @@
           <w:rFonts w:ascii="微软雅黑" w:eastAsia="微软雅黑" w:hAnsi="微软雅黑"/>
           <w:lang w:eastAsia="zh-CN"/>
         </w:rPr>
-        <w:t>交付物实时生成</w:t>
+        <w:t>交付物持续累积演化</w:t>
       </w:r>
     </w:p>
     <w:p>
@@ -2177,7 +2172,7 @@
           <w:rFonts w:ascii="微软雅黑" w:eastAsia="微软雅黑" w:hAnsi="微软雅黑"/>
           <w:lang w:eastAsia="zh-CN"/>
         </w:rPr>
-        <w:t>- 软件需求实时编译引擎</w:t>
+        <w:t>- 软件需求持续累积引擎</w:t>
       </w:r>
     </w:p>
     <w:p>

</xml_diff>

<commit_message>
docs: v1.3/v1.2 同步 - VPBuddy_产品说明书.docx
</commit_message>
<xml_diff>
--- a/docs/product-spec/VPBuddy_产品说明书.docx
+++ b/docs/product-spec/VPBuddy_产品说明书.docx
@@ -163,7 +163,7 @@
           <w:rFonts w:ascii="微软雅黑" w:eastAsia="微软雅黑" w:hAnsi="微软雅黑"/>
           <w:lang w:eastAsia="zh-CN"/>
         </w:rPr>
-        <w:t>在腾讯会议 / 飞书 / 钉钉 / Zoom 中，VPBuddy 后台持续累积(无延迟约束),按 VP 主动调取:</w:t>
+        <w:t>在腾讯会议 / 飞书 / 钉钉 / Zoom 中,VPBuddy 后台并行做两件事:① 累积结构化信息(客户需求/业务目标/风险点),② 持续生成候选交付物(Demo/页面/数据模型/任务清单等)。VP 任何时候调取,都已有可投屏的候选交付物:</w:t>
       </w:r>
       <w:proofErr w:type="gramEnd"/>
       <w:r>
@@ -199,67 +199,67 @@
           <w:rFonts w:ascii="微软雅黑" w:eastAsia="微软雅黑" w:hAnsi="微软雅黑"/>
           <w:lang w:eastAsia="zh-CN"/>
         </w:rPr>
-        <w:t>- 会议理解与结构化建模</w:t>
-      </w:r>
-    </w:p>
-    <w:p>
-      <w:pPr>
-        <w:rPr>
-          <w:rFonts w:ascii="微软雅黑" w:eastAsia="微软雅黑" w:hAnsi="微软雅黑"/>
-          <w:lang w:eastAsia="zh-CN"/>
-        </w:rPr>
-      </w:pPr>
-      <w:r>
-        <w:rPr>
-          <w:rFonts w:ascii="微软雅黑" w:eastAsia="微软雅黑" w:hAnsi="微软雅黑"/>
-          <w:lang w:eastAsia="zh-CN"/>
-        </w:rPr>
-        <w:t>- 需求分析与追问</w:t>
-      </w:r>
-    </w:p>
-    <w:p>
-      <w:pPr>
-        <w:rPr>
-          <w:rFonts w:ascii="微软雅黑" w:eastAsia="微软雅黑" w:hAnsi="微软雅黑"/>
-          <w:lang w:eastAsia="zh-CN"/>
-        </w:rPr>
-      </w:pPr>
-      <w:r>
-        <w:rPr>
-          <w:rFonts w:ascii="微软雅黑" w:eastAsia="微软雅黑" w:hAnsi="微软雅黑"/>
-          <w:lang w:eastAsia="zh-CN"/>
-        </w:rPr>
-        <w:t>- 解释材料生成</w:t>
-      </w:r>
-    </w:p>
-    <w:p>
-      <w:pPr>
-        <w:rPr>
-          <w:rFonts w:ascii="微软雅黑" w:eastAsia="微软雅黑" w:hAnsi="微软雅黑"/>
-          <w:lang w:eastAsia="zh-CN"/>
-        </w:rPr>
-      </w:pPr>
-      <w:r>
-        <w:rPr>
-          <w:rFonts w:ascii="微软雅黑" w:eastAsia="微软雅黑" w:hAnsi="微软雅黑"/>
-          <w:lang w:eastAsia="zh-CN"/>
-        </w:rPr>
-        <w:t>- Sub-agent并行推理</w:t>
-      </w:r>
-    </w:p>
-    <w:p>
-      <w:pPr>
-        <w:rPr>
-          <w:rFonts w:ascii="微软雅黑" w:eastAsia="微软雅黑" w:hAnsi="微软雅黑"/>
-          <w:lang w:eastAsia="zh-CN"/>
-        </w:rPr>
-      </w:pPr>
-      <w:r>
-        <w:rPr>
-          <w:rFonts w:ascii="微软雅黑" w:eastAsia="微软雅黑" w:hAnsi="微软雅黑"/>
-          <w:lang w:eastAsia="zh-CN"/>
-        </w:rPr>
-        <w:t>- 交互Demo与交付物生成</w:t>
+        <w:t>- 会议理解与结构化累积</w:t>
+      </w:r>
+    </w:p>
+    <w:p>
+      <w:pPr>
+        <w:rPr>
+          <w:rFonts w:ascii="微软雅黑" w:eastAsia="微软雅黑" w:hAnsi="微软雅黑"/>
+          <w:lang w:eastAsia="zh-CN"/>
+        </w:rPr>
+      </w:pPr>
+      <w:r>
+        <w:rPr>
+          <w:rFonts w:ascii="微软雅黑" w:eastAsia="微软雅黑" w:hAnsi="微软雅黑"/>
+          <w:lang w:eastAsia="zh-CN"/>
+        </w:rPr>
+        <w:t>- 需求分析(后台)</w:t>
+      </w:r>
+    </w:p>
+    <w:p>
+      <w:pPr>
+        <w:rPr>
+          <w:rFonts w:ascii="微软雅黑" w:eastAsia="微软雅黑" w:hAnsi="微软雅黑"/>
+          <w:lang w:eastAsia="zh-CN"/>
+        </w:rPr>
+      </w:pPr>
+      <w:r>
+        <w:rPr>
+          <w:rFonts w:ascii="微软雅黑" w:eastAsia="微软雅黑" w:hAnsi="微软雅黑"/>
+          <w:lang w:eastAsia="zh-CN"/>
+        </w:rPr>
+        <w:t>- 解释材料生成(后台)</w:t>
+      </w:r>
+    </w:p>
+    <w:p>
+      <w:pPr>
+        <w:rPr>
+          <w:rFonts w:ascii="微软雅黑" w:eastAsia="微软雅黑" w:hAnsi="微软雅黑"/>
+          <w:lang w:eastAsia="zh-CN"/>
+        </w:rPr>
+      </w:pPr>
+      <w:r>
+        <w:rPr>
+          <w:rFonts w:ascii="微软雅黑" w:eastAsia="微软雅黑" w:hAnsi="微软雅黑"/>
+          <w:lang w:eastAsia="zh-CN"/>
+        </w:rPr>
+        <w:t>- Sub-agent并行推理(后台)</w:t>
+      </w:r>
+    </w:p>
+    <w:p>
+      <w:pPr>
+        <w:rPr>
+          <w:rFonts w:ascii="微软雅黑" w:eastAsia="微软雅黑" w:hAnsi="微软雅黑"/>
+          <w:lang w:eastAsia="zh-CN"/>
+        </w:rPr>
+      </w:pPr>
+      <w:r>
+        <w:rPr>
+          <w:rFonts w:ascii="微软雅黑" w:eastAsia="微软雅黑" w:hAnsi="微软雅黑"/>
+          <w:lang w:eastAsia="zh-CN"/>
+        </w:rPr>
+        <w:t>- 交互Demo与交付物持续生成(后台并行,VP 调取即用)</w:t>
       </w:r>
     </w:p>
     <w:p>
@@ -289,7 +289,7 @@
           <w:rFonts w:ascii="微软雅黑" w:eastAsia="微软雅黑" w:hAnsi="微软雅黑"/>
           <w:lang w:eastAsia="zh-CN"/>
         </w:rPr>
-        <w:t>- 软件交付资产持续累积(后台),按 VP 主动调取生成</w:t>
+        <w:t>- 软件交付资产持续累积+生成(后台并行)</w:t>
       </w:r>
     </w:p>
     <w:p>
@@ -754,7 +754,7 @@
           <w:rFonts w:ascii="微软雅黑" w:eastAsia="微软雅黑" w:hAnsi="微软雅黑"/>
           <w:lang w:eastAsia="zh-CN"/>
         </w:rPr>
-        <w:t>会议持续结构化为(后台,无延迟约束):</w:t>
+        <w:t>会议持续累积结构化为(后台,无延迟约束):</w:t>
       </w:r>
     </w:p>
     <w:p>
@@ -984,7 +984,7 @@
           <w:rFonts w:ascii="微软雅黑" w:eastAsia="微软雅黑" w:hAnsi="微软雅黑"/>
           <w:lang w:eastAsia="zh-CN"/>
         </w:rPr>
-        <w:t>在会议过程中持续累积(后台),按 VP 主动调取:</w:t>
+        <w:t>在会议过程中后台持续生成候选交付物,VP 调取即用:</w:t>
       </w:r>
     </w:p>
     <w:p>
@@ -1127,7 +1127,7 @@
           <w:rFonts w:ascii="微软雅黑" w:eastAsia="微软雅黑" w:hAnsi="微软雅黑"/>
           <w:lang w:eastAsia="zh-CN"/>
         </w:rPr>
-        <w:t>核心机制:交付物持续累积演化(后台)+ VP 主动调取投屏(1-3min 软目标),而非一次性生成</w:t>
+        <w:t>核心机制:交付物后台持续生成+ 持续累积演化(无延迟约束)+ VP 主动调取/调整/外发(1-3min 软目标),而非一次性生成</w:t>
       </w:r>
       <w:proofErr w:type="gramStart"/>
       <w:r>
@@ -1951,7 +1951,7 @@
           <w:rFonts w:ascii="微软雅黑" w:eastAsia="微软雅黑" w:hAnsi="微软雅黑"/>
           <w:lang w:eastAsia="zh-CN"/>
         </w:rPr>
-        <w:t>Agent并行推理</w:t>
+        <w:t>后台 Agent 并行推理</w:t>
       </w:r>
     </w:p>
     <w:p>
@@ -2011,7 +2011,7 @@
           <w:rFonts w:ascii="微软雅黑" w:eastAsia="微软雅黑" w:hAnsi="微软雅黑"/>
           <w:lang w:eastAsia="zh-CN"/>
         </w:rPr>
-        <w:t>交付物持续累积演化</w:t>
+        <w:t>后台持续生成候选交付物</w:t>
       </w:r>
     </w:p>
     <w:p>
@@ -2172,7 +2172,7 @@
           <w:rFonts w:ascii="微软雅黑" w:eastAsia="微软雅黑" w:hAnsi="微软雅黑"/>
           <w:lang w:eastAsia="zh-CN"/>
         </w:rPr>
-        <w:t>- 软件需求持续累积引擎</w:t>
+        <w:t>- 软件需求持续累积+生成引擎</w:t>
       </w:r>
     </w:p>
     <w:p>

</xml_diff>

<commit_message>
docs: v1.4/v1.3 同步 - VPBuddy_产品说明书.docx
</commit_message>
<xml_diff>
--- a/docs/product-spec/VPBuddy_产品说明书.docx
+++ b/docs/product-spec/VPBuddy_产品说明书.docx
@@ -1458,7 +1458,7 @@
           <w:rFonts w:ascii="微软雅黑" w:eastAsia="微软雅黑" w:hAnsi="微软雅黑"/>
           <w:lang w:eastAsia="zh-CN"/>
         </w:rPr>
-        <w:t>知识库是统一约束系统，包含三类知识：</w:t>
+        <w:t>知识库是统一的双模式系统(约束 + 检索),包含三类知识:</w:t>
       </w:r>
     </w:p>
     <w:p>
@@ -1755,7 +1755,7 @@
           <w:rFonts w:ascii="微软雅黑" w:eastAsia="微软雅黑" w:hAnsi="微软雅黑"/>
           <w:lang w:eastAsia="zh-CN"/>
         </w:rPr>
-        <w:t>不是查询，而是约束AI生成逻辑</w:t>
+        <w:t>知识分两类,各有用法:① 约束类(规则/SOP/规范)→ 注入 system prompt,LLM 必须遵守;② 检索类(案例/历史/文档)→ RAG 路径,LLM 参考引用。详细机制见 v1.4 架构 §4.5</w:t>
       </w:r>
     </w:p>
     <w:p>

</xml_diff>

<commit_message>
docs: v1.5/v1.4 同步 - VPBuddy_产品说明书.docx
</commit_message>
<xml_diff>
--- a/docs/product-spec/VPBuddy_产品说明书.docx
+++ b/docs/product-spec/VPBuddy_产品说明书.docx
@@ -1458,7 +1458,7 @@
           <w:rFonts w:ascii="微软雅黑" w:eastAsia="微软雅黑" w:hAnsi="微软雅黑"/>
           <w:lang w:eastAsia="zh-CN"/>
         </w:rPr>
-        <w:t>知识库是统一的双模式系统(约束 + 检索),包含三类知识:</w:t>
+        <w:t>知识库包含三类知识,采用**展示+检索**双模式;后台**实时提取并展示**,VP 可改但**不阻塞 AI 继续做 demo**;约束**不注入 system prompt**。</w:t>
       </w:r>
     </w:p>
     <w:p>
@@ -1755,7 +1755,7 @@
           <w:rFonts w:ascii="微软雅黑" w:eastAsia="微软雅黑" w:hAnsi="微软雅黑"/>
           <w:lang w:eastAsia="zh-CN"/>
         </w:rPr>
-        <w:t>知识分两类,各有用法:① 约束类(规则/SOP/规范)→ 注入 system prompt,LLM 必须遵守;② 检索类(案例/历史/文档)→ RAG 路径,LLM 参考引用。详细机制见 v1.4 架构 §4.5</w:t>
+        <w:t>知识分两类,各有用法:① **展示类**(`mode: constraint`)= 后台实时识别,展示在 Demo/页面/数据模型上,VP 可看/改/问,**不强制确认,不阻塞 AI 继续做**;② **检索类**(`mode: retrieval`)= 按需 RAG 检索历史案例,VP 采纳后替换当前展示。**约束不注入 system prompt**,只是给 VP 看的标注。详细机制见 v1.5 架构 §4.5</w:t>
       </w:r>
     </w:p>
     <w:p>

</xml_diff>

<commit_message>
docs: v1.6/v1.5 同步 - VPBuddy_产品说明书.docx
</commit_message>
<xml_diff>
--- a/docs/product-spec/VPBuddy_产品说明书.docx
+++ b/docs/product-spec/VPBuddy_产品说明书.docx
@@ -1127,7 +1127,7 @@
           <w:rFonts w:ascii="微软雅黑" w:eastAsia="微软雅黑" w:hAnsi="微软雅黑"/>
           <w:lang w:eastAsia="zh-CN"/>
         </w:rPr>
-        <w:t>核心机制:交付物后台持续生成+ 持续累积演化(无延迟约束)+ VP 主动调取/调整/外发(1-3min 软目标),而非一次性生成</w:t>
+        <w:t>核心机制:交付物后台持续生成+ 持续累积演化(无延迟约束)+ **VP 在过程中持续 steer**(改/跳/加/换/参考,任何时候给出方向性输入,AI 实时整合,无『已完成』概念);投屏/外发 = VP 任何时候想看/想发当前状态</w:t>
       </w:r>
       <w:proofErr w:type="gramStart"/>
       <w:r>
@@ -1163,128 +1163,126 @@
         <w:rPr>
           <w:rFonts w:ascii="微软雅黑" w:eastAsia="微软雅黑" w:hAnsi="微软雅黑"/>
         </w:rPr>
-        <w:t>七、指令控制层（Command</w:t>
+        <w:t>七、Steer 控制层(Steer Center,v1.5 改名)</w:t>
       </w:r>
       <w:proofErr w:type="spellEnd"/>
       <w:r>
         <w:rPr>
           <w:rFonts w:ascii="微软雅黑" w:eastAsia="微软雅黑" w:hAnsi="微软雅黑"/>
         </w:rPr>
-        <w:t xml:space="preserve"> Center）</w:t>
-      </w:r>
-    </w:p>
-    <w:p>
-      <w:pPr>
-        <w:rPr>
-          <w:rFonts w:ascii="微软雅黑" w:eastAsia="微软雅黑" w:hAnsi="微软雅黑"/>
-        </w:rPr>
-      </w:pPr>
-      <w:r>
-        <w:rPr>
-          <w:rFonts w:ascii="微软雅黑" w:eastAsia="微软雅黑" w:hAnsi="微软雅黑"/>
-        </w:rPr>
-        <w:t>VP与VPBuddy唯一交互入口</w:t>
-      </w:r>
-    </w:p>
-    <w:p>
-      <w:pPr>
-        <w:rPr>
-          <w:rFonts w:ascii="微软雅黑" w:eastAsia="微软雅黑" w:hAnsi="微软雅黑"/>
-        </w:rPr>
-      </w:pPr>
-      <w:r>
-        <w:rPr>
-          <w:rFonts w:ascii="微软雅黑" w:eastAsia="微软雅黑" w:hAnsi="微软雅黑"/>
-        </w:rPr>
-        <w:t>支持自然语言指令：</w:t>
-      </w:r>
-    </w:p>
-    <w:p>
-      <w:pPr>
-        <w:rPr>
-          <w:rFonts w:ascii="微软雅黑" w:eastAsia="微软雅黑" w:hAnsi="微软雅黑"/>
-        </w:rPr>
-      </w:pPr>
-      <w:r>
-        <w:rPr>
-          <w:rFonts w:ascii="微软雅黑" w:eastAsia="微软雅黑" w:hAnsi="微软雅黑"/>
-        </w:rPr>
-        <w:t>- 修改UI/功能</w:t>
-      </w:r>
-    </w:p>
-    <w:p>
-      <w:pPr>
-        <w:rPr>
-          <w:rFonts w:ascii="微软雅黑" w:eastAsia="微软雅黑" w:hAnsi="微软雅黑"/>
-        </w:rPr>
-      </w:pPr>
-      <w:r>
-        <w:rPr>
-          <w:rFonts w:ascii="微软雅黑" w:eastAsia="微软雅黑" w:hAnsi="微软雅黑"/>
-        </w:rPr>
-        <w:lastRenderedPageBreak/>
-        <w:t>- 生成Demo</w:t>
-      </w:r>
-    </w:p>
-    <w:p>
-      <w:pPr>
-        <w:rPr>
-          <w:rFonts w:ascii="微软雅黑" w:eastAsia="微软雅黑" w:hAnsi="微软雅黑"/>
-        </w:rPr>
-      </w:pPr>
-      <w:r>
-        <w:rPr>
-          <w:rFonts w:ascii="微软雅黑" w:eastAsia="微软雅黑" w:hAnsi="微软雅黑"/>
-        </w:rPr>
-        <w:t>- 拆解任务</w:t>
-      </w:r>
-    </w:p>
-    <w:p>
-      <w:pPr>
-        <w:rPr>
-          <w:rFonts w:ascii="微软雅黑" w:eastAsia="微软雅黑" w:hAnsi="微软雅黑"/>
-        </w:rPr>
-      </w:pPr>
-      <w:r>
-        <w:rPr>
-          <w:rFonts w:ascii="微软雅黑" w:eastAsia="微软雅黑" w:hAnsi="微软雅黑"/>
-        </w:rPr>
-        <w:t>- 调用知识库</w:t>
-      </w:r>
-    </w:p>
-    <w:p>
-      <w:pPr>
-        <w:rPr>
-          <w:rFonts w:ascii="微软雅黑" w:eastAsia="微软雅黑" w:hAnsi="微软雅黑"/>
-        </w:rPr>
-      </w:pPr>
-      <w:r>
-        <w:rPr>
-          <w:rFonts w:ascii="微软雅黑" w:eastAsia="微软雅黑" w:hAnsi="微软雅黑"/>
-        </w:rPr>
-        <w:t>- 控制AI行为</w:t>
-      </w:r>
-    </w:p>
-    <w:p>
-      <w:pPr>
-        <w:rPr>
-          <w:rFonts w:ascii="微软雅黑" w:eastAsia="微软雅黑" w:hAnsi="微软雅黑"/>
-        </w:rPr>
-      </w:pPr>
-    </w:p>
-    <w:p>
-      <w:pPr>
-        <w:rPr>
-          <w:rFonts w:ascii="微软雅黑" w:eastAsia="微软雅黑" w:hAnsi="微软雅黑"/>
-          <w:lang w:eastAsia="zh-CN"/>
-        </w:rPr>
-      </w:pPr>
-      <w:r>
-        <w:rPr>
-          <w:rFonts w:ascii="微软雅黑" w:eastAsia="微软雅黑" w:hAnsi="微软雅黑"/>
-          <w:lang w:eastAsia="zh-CN"/>
-        </w:rPr>
-        <w:t>本质：会议操作系统的控制台</w:t>
+      </w:r>
+    </w:p>
+    <w:p>
+      <w:pPr>
+        <w:rPr>
+          <w:rFonts w:ascii="微软雅黑" w:eastAsia="微软雅黑" w:hAnsi="微软雅黑"/>
+        </w:rPr>
+      </w:pPr>
+      <w:r>
+        <w:rPr>
+          <w:rFonts w:ascii="微软雅黑" w:eastAsia="微软雅黑" w:hAnsi="微软雅黑"/>
+        </w:rPr>
+        <w:t>VP与VPBuddy唯一交互入口(v1.5 改为『steer 入口』)</w:t>
+      </w:r>
+    </w:p>
+    <w:p>
+      <w:pPr>
+        <w:rPr>
+          <w:rFonts w:ascii="微软雅黑" w:eastAsia="微软雅黑" w:hAnsi="微软雅黑"/>
+        </w:rPr>
+      </w:pPr>
+      <w:r>
+        <w:rPr>
+          <w:rFonts w:ascii="微软雅黑" w:eastAsia="微软雅黑" w:hAnsi="微软雅黑"/>
+        </w:rPr>
+        <w:t>VP 在会议中**持续 steer(方向盘式引导)**:随时给出方向性输入,AI 边做边接收,边整合,边继续。**没有『已完成』概念**——不是"完成后的干预",而是"持续过程中的方向引导"。支持:</w:t>
+      </w:r>
+    </w:p>
+    <w:p>
+      <w:pPr>
+        <w:rPr>
+          <w:rFonts w:ascii="微软雅黑" w:eastAsia="微软雅黑" w:hAnsi="微软雅黑"/>
+        </w:rPr>
+      </w:pPr>
+      <w:r>
+        <w:rPr>
+          <w:rFonts w:ascii="微软雅黑" w:eastAsia="微软雅黑" w:hAnsi="微软雅黑"/>
+        </w:rPr>
+        <w:t>- 修改 UI/功能(steer Demo 方向)</w:t>
+      </w:r>
+    </w:p>
+    <w:p>
+      <w:pPr>
+        <w:rPr>
+          <w:rFonts w:ascii="微软雅黑" w:eastAsia="微软雅黑" w:hAnsi="微软雅黑"/>
+        </w:rPr>
+      </w:pPr>
+      <w:r>
+        <w:rPr>
+          <w:rFonts w:ascii="微软雅黑" w:eastAsia="微软雅黑" w:hAnsi="微软雅黑"/>
+        </w:rPr>
+        <w:t>- 跳过某项(steer 任务优先级)</w:t>
+      </w:r>
+    </w:p>
+    <w:p>
+      <w:pPr>
+        <w:rPr>
+          <w:rFonts w:ascii="微软雅黑" w:eastAsia="微软雅黑" w:hAnsi="微软雅黑"/>
+        </w:rPr>
+      </w:pPr>
+      <w:r>
+        <w:rPr>
+          <w:rFonts w:ascii="微软雅黑" w:eastAsia="微软雅黑" w:hAnsi="微软雅黑"/>
+        </w:rPr>
+        <w:t>- 加个字段(steer 数据模型)</w:t>
+      </w:r>
+    </w:p>
+    <w:p>
+      <w:pPr>
+        <w:rPr>
+          <w:rFonts w:ascii="微软雅黑" w:eastAsia="微软雅黑" w:hAnsi="微软雅黑"/>
+        </w:rPr>
+      </w:pPr>
+      <w:r>
+        <w:rPr>
+          <w:rFonts w:ascii="微软雅黑" w:eastAsia="微软雅黑" w:hAnsi="微软雅黑"/>
+        </w:rPr>
+        <w:t>- 调参考(steer 知识库约束)</w:t>
+      </w:r>
+    </w:p>
+    <w:p>
+      <w:pPr>
+        <w:rPr>
+          <w:rFonts w:ascii="微软雅黑" w:eastAsia="微软雅黑" w:hAnsi="微软雅黑"/>
+        </w:rPr>
+      </w:pPr>
+      <w:r>
+        <w:rPr>
+          <w:rFonts w:ascii="微软雅黑" w:eastAsia="微软雅黑" w:hAnsi="微软雅黑"/>
+        </w:rPr>
+        <w:t>- 控制 AI 行为(steer prompt)</w:t>
+      </w:r>
+    </w:p>
+    <w:p>
+      <w:pPr>
+        <w:rPr>
+          <w:rFonts w:ascii="微软雅黑" w:eastAsia="微软雅黑" w:hAnsi="微软雅黑"/>
+        </w:rPr>
+      </w:pPr>
+    </w:p>
+    <w:p>
+      <w:pPr>
+        <w:rPr>
+          <w:rFonts w:ascii="微软雅黑" w:eastAsia="微软雅黑" w:hAnsi="微软雅黑"/>
+          <w:lang w:eastAsia="zh-CN"/>
+        </w:rPr>
+      </w:pPr>
+      <w:r>
+        <w:rPr>
+          <w:rFonts w:ascii="微软雅黑" w:eastAsia="微软雅黑" w:hAnsi="微软雅黑"/>
+          <w:lang w:eastAsia="zh-CN"/>
+        </w:rPr>
+        <w:t>本质:**方向盘式引导**(v1.5 改),不是"批改已完成的成果";VP 在过程中持续 steer,AI 持续整合,投屏/外发是 VP 想看/想发的时刻,不是"完成"标志</w:t>
       </w:r>
     </w:p>
     <w:p>
@@ -2041,22 +2039,6 @@
           <w:rFonts w:ascii="微软雅黑" w:eastAsia="微软雅黑" w:hAnsi="微软雅黑"/>
           <w:lang w:eastAsia="zh-CN"/>
         </w:rPr>
-        <w:t>Command Center控制</w:t>
-      </w:r>
-    </w:p>
-    <w:p>
-      <w:pPr>
-        <w:rPr>
-          <w:rFonts w:ascii="微软雅黑" w:eastAsia="微软雅黑" w:hAnsi="微软雅黑"/>
-          <w:lang w:eastAsia="zh-CN"/>
-        </w:rPr>
-      </w:pPr>
-      <w:r>
-        <w:rPr>
-          <w:rFonts w:ascii="微软雅黑" w:eastAsia="微软雅黑" w:hAnsi="微软雅黑"/>
-          <w:lang w:eastAsia="zh-CN"/>
-        </w:rPr>
-        <w:lastRenderedPageBreak/>
         <w:t>↓</w:t>
       </w:r>
     </w:p>
@@ -2072,7 +2054,22 @@
           <w:rFonts w:ascii="微软雅黑" w:eastAsia="微软雅黑" w:hAnsi="微软雅黑"/>
           <w:lang w:eastAsia="zh-CN"/>
         </w:rPr>
-        <w:t>人类确认与投屏</w:t>
+        <w:t>VP 持续 steer(任何时候)</w:t>
+      </w:r>
+    </w:p>
+    <w:p>
+      <w:pPr>
+        <w:rPr>
+          <w:rFonts w:ascii="微软雅黑" w:eastAsia="微软雅黑" w:hAnsi="微软雅黑"/>
+          <w:lang w:eastAsia="zh-CN"/>
+        </w:rPr>
+      </w:pPr>
+      <w:r>
+        <w:rPr>
+          <w:rFonts w:ascii="微软雅黑" w:eastAsia="微软雅黑" w:hAnsi="微软雅黑"/>
+          <w:lang w:eastAsia="zh-CN"/>
+        </w:rPr>
+        <w:t>↓</w:t>
       </w:r>
     </w:p>
     <w:p>
@@ -2188,6 +2185,11 @@
           <w:lang w:eastAsia="zh-CN"/>
         </w:rPr>
         <w:t>- 企业知识驱动的交付生成系统</w:t>
+      </w:r>
+    </w:p>
+    <w:p>
+      <w:r>
+        <w:t>VP 任何时候投屏/外发(无『完成』前提)</w:t>
       </w:r>
     </w:p>
     <w:sectPr>

</xml_diff>

<commit_message>
docs: v1.7/v1.6 同步 - VPBuddy_产品说明书.docx
</commit_message>
<xml_diff>
--- a/docs/product-spec/VPBuddy_产品说明书.docx
+++ b/docs/product-spec/VPBuddy_产品说明书.docx
@@ -62,6 +62,74 @@
           <w:rFonts w:ascii="微软雅黑" w:eastAsia="微软雅黑" w:hAnsi="微软雅黑"/>
           <w:lang w:eastAsia="zh-CN"/>
         </w:rPr>
+        <w:t>VPBuddy 是面向软件开发公司 VP / 售前负责人 / 项目负责人的 人机协同会议操作系统级 AI 助手,**运行在 Hermes Agent 之上**(v1.6 新增底层说明)。一个会议 = Hermes 一个 session,系列会议 = 同一 session 持续。</w:t>
+      </w:r>
+      <w:proofErr w:type="spellEnd"/>
+      <w:r>
+        <w:rPr>
+          <w:rFonts w:ascii="微软雅黑" w:eastAsia="微软雅黑" w:hAnsi="微软雅黑"/>
+          <w:lang w:eastAsia="zh-CN"/>
+        </w:rPr>
+      </w:r>
+    </w:p>
+    <w:p>
+      <w:pPr>
+        <w:rPr>
+          <w:rFonts w:ascii="微软雅黑" w:eastAsia="微软雅黑" w:hAnsi="微软雅黑"/>
+          <w:lang w:eastAsia="zh-CN"/>
+        </w:rPr>
+      </w:pPr>
+    </w:p>
+    <w:p>
+      <w:pPr>
+        <w:rPr>
+          <w:rFonts w:ascii="微软雅黑" w:eastAsia="微软雅黑" w:hAnsi="微软雅黑"/>
+          <w:lang w:eastAsia="zh-CN"/>
+        </w:rPr>
+      </w:pPr>
+      <w:r>
+        <w:rPr>
+          <w:rFonts w:ascii="微软雅黑" w:eastAsia="微软雅黑" w:hAnsi="微软雅黑"/>
+          <w:lang w:eastAsia="zh-CN"/>
+        </w:rPr>
+        <w:t>它不是传统意义上的AI助手，而是运行在会议中的协同系统：</w:t>
+      </w:r>
+    </w:p>
+    <w:p>
+      <w:pPr>
+        <w:rPr>
+          <w:rFonts w:ascii="微软雅黑" w:eastAsia="微软雅黑" w:hAnsi="微软雅黑"/>
+          <w:lang w:eastAsia="zh-CN"/>
+        </w:rPr>
+      </w:pPr>
+      <w:r>
+        <w:rPr>
+          <w:rFonts w:ascii="微软雅黑" w:eastAsia="微软雅黑" w:hAnsi="微软雅黑"/>
+          <w:lang w:eastAsia="zh-CN"/>
+        </w:rPr>
+        <w:t>- 人类负责决策与主导</w:t>
+      </w:r>
+    </w:p>
+    <w:p>
+      <w:pPr>
+        <w:rPr>
+          <w:rFonts w:ascii="微软雅黑" w:eastAsia="微软雅黑" w:hAnsi="微软雅黑"/>
+          <w:lang w:eastAsia="zh-CN"/>
+        </w:rPr>
+      </w:pPr>
+      <w:r>
+        <w:rPr>
+          <w:rFonts w:ascii="微软雅黑" w:eastAsia="微软雅黑" w:hAnsi="微软雅黑"/>
+          <w:lang w:eastAsia="zh-CN"/>
+        </w:rPr>
+        <w:t xml:space="preserve">- </w:t>
+      </w:r>
+      <w:proofErr w:type="spellStart"/>
+      <w:r>
+        <w:rPr>
+          <w:rFonts w:ascii="微软雅黑" w:eastAsia="微软雅黑" w:hAnsi="微软雅黑"/>
+          <w:lang w:eastAsia="zh-CN"/>
+        </w:rPr>
         <w:t>VPBuddy</w:t>
       </w:r>
       <w:proofErr w:type="spellEnd"/>
@@ -70,60 +138,38 @@
           <w:rFonts w:ascii="微软雅黑" w:eastAsia="微软雅黑" w:hAnsi="微软雅黑"/>
           <w:lang w:eastAsia="zh-CN"/>
         </w:rPr>
-        <w:t xml:space="preserve"> 是面向软件开发公司 VP / 售前负责人 / 项目负责人的 人机协同会议操作系统级 AI 助手。</w:t>
-      </w:r>
-    </w:p>
-    <w:p>
-      <w:pPr>
-        <w:rPr>
-          <w:rFonts w:ascii="微软雅黑" w:eastAsia="微软雅黑" w:hAnsi="微软雅黑"/>
-          <w:lang w:eastAsia="zh-CN"/>
-        </w:rPr>
-      </w:pPr>
-    </w:p>
-    <w:p>
-      <w:pPr>
-        <w:rPr>
-          <w:rFonts w:ascii="微软雅黑" w:eastAsia="微软雅黑" w:hAnsi="微软雅黑"/>
-          <w:lang w:eastAsia="zh-CN"/>
-        </w:rPr>
-      </w:pPr>
-      <w:r>
-        <w:rPr>
-          <w:rFonts w:ascii="微软雅黑" w:eastAsia="微软雅黑" w:hAnsi="微软雅黑"/>
-          <w:lang w:eastAsia="zh-CN"/>
-        </w:rPr>
-        <w:t>它不是传统意义上的AI助手，而是运行在会议中的协同系统：</w:t>
-      </w:r>
-    </w:p>
-    <w:p>
-      <w:pPr>
-        <w:rPr>
-          <w:rFonts w:ascii="微软雅黑" w:eastAsia="微软雅黑" w:hAnsi="微软雅黑"/>
-          <w:lang w:eastAsia="zh-CN"/>
-        </w:rPr>
-      </w:pPr>
-      <w:r>
-        <w:rPr>
-          <w:rFonts w:ascii="微软雅黑" w:eastAsia="微软雅黑" w:hAnsi="微软雅黑"/>
-          <w:lang w:eastAsia="zh-CN"/>
-        </w:rPr>
-        <w:t>- 人类负责决策与主导</w:t>
-      </w:r>
-    </w:p>
-    <w:p>
-      <w:pPr>
-        <w:rPr>
-          <w:rFonts w:ascii="微软雅黑" w:eastAsia="微软雅黑" w:hAnsi="微软雅黑"/>
-          <w:lang w:eastAsia="zh-CN"/>
-        </w:rPr>
-      </w:pPr>
-      <w:r>
-        <w:rPr>
-          <w:rFonts w:ascii="微软雅黑" w:eastAsia="微软雅黑" w:hAnsi="微软雅黑"/>
-          <w:lang w:eastAsia="zh-CN"/>
-        </w:rPr>
-        <w:t xml:space="preserve">- </w:t>
+        <w:t>负责理解、结构化、生成与演化</w:t>
+      </w:r>
+    </w:p>
+    <w:p>
+      <w:pPr>
+        <w:rPr>
+          <w:rFonts w:ascii="微软雅黑" w:eastAsia="微软雅黑" w:hAnsi="微软雅黑"/>
+          <w:lang w:eastAsia="zh-CN"/>
+        </w:rPr>
+      </w:pPr>
+    </w:p>
+    <w:p>
+      <w:pPr>
+        <w:rPr>
+          <w:rFonts w:ascii="微软雅黑" w:eastAsia="微软雅黑" w:hAnsi="微软雅黑"/>
+          <w:lang w:eastAsia="zh-CN"/>
+        </w:rPr>
+      </w:pPr>
+      <w:proofErr w:type="gramStart"/>
+      <w:r>
+        <w:rPr>
+          <w:rFonts w:ascii="微软雅黑" w:eastAsia="微软雅黑" w:hAnsi="微软雅黑"/>
+          <w:lang w:eastAsia="zh-CN"/>
+        </w:rPr>
+        <w:t>在腾讯会议 / 飞书 / 钉钉 / Zoom 中,VPBuddy 后台并行做两件事:① 累积结构化信息(客户需求/业务目标/风险点),② 持续生成候选交付物(Demo/页面/数据模型/任务清单等)。VP 任何时候调取,都已有可投屏的候选交付物(由 hermes skill 持续生成):</w:t>
+      </w:r>
+      <w:proofErr w:type="gramEnd"/>
+      <w:r>
+        <w:rPr>
+          <w:rFonts w:ascii="微软雅黑" w:eastAsia="微软雅黑" w:hAnsi="微软雅黑"/>
+          <w:lang w:eastAsia="zh-CN"/>
+        </w:rPr>
       </w:r>
       <w:proofErr w:type="spellStart"/>
       <w:r>
@@ -131,7 +177,6 @@
           <w:rFonts w:ascii="微软雅黑" w:eastAsia="微软雅黑" w:hAnsi="微软雅黑"/>
           <w:lang w:eastAsia="zh-CN"/>
         </w:rPr>
-        <w:t>VPBuddy</w:t>
       </w:r>
       <w:proofErr w:type="spellEnd"/>
       <w:r>
@@ -139,45 +184,165 @@
           <w:rFonts w:ascii="微软雅黑" w:eastAsia="微软雅黑" w:hAnsi="微软雅黑"/>
           <w:lang w:eastAsia="zh-CN"/>
         </w:rPr>
-        <w:t>负责理解、结构化、生成与演化</w:t>
-      </w:r>
-    </w:p>
-    <w:p>
-      <w:pPr>
-        <w:rPr>
-          <w:rFonts w:ascii="微软雅黑" w:eastAsia="微软雅黑" w:hAnsi="微软雅黑"/>
-          <w:lang w:eastAsia="zh-CN"/>
-        </w:rPr>
-      </w:pPr>
-    </w:p>
-    <w:p>
-      <w:pPr>
-        <w:rPr>
-          <w:rFonts w:ascii="微软雅黑" w:eastAsia="微软雅黑" w:hAnsi="微软雅黑"/>
-          <w:lang w:eastAsia="zh-CN"/>
-        </w:rPr>
-      </w:pPr>
-      <w:proofErr w:type="gramStart"/>
-      <w:r>
-        <w:rPr>
-          <w:rFonts w:ascii="微软雅黑" w:eastAsia="微软雅黑" w:hAnsi="微软雅黑"/>
-          <w:lang w:eastAsia="zh-CN"/>
-        </w:rPr>
-        <w:t>在腾讯会议 / 飞书 / 钉钉 / Zoom 中,VPBuddy 后台并行做两件事:① 累积结构化信息(客户需求/业务目标/风险点),② 持续生成候选交付物(Demo/页面/数据模型/任务清单等)。VP 任何时候调取,都已有可投屏的候选交付物:</w:t>
-      </w:r>
-      <w:proofErr w:type="gramEnd"/>
-      <w:r>
-        <w:rPr>
-          <w:rFonts w:ascii="微软雅黑" w:eastAsia="微软雅黑" w:hAnsi="微软雅黑"/>
-          <w:lang w:eastAsia="zh-CN"/>
-        </w:rPr>
-      </w:r>
+      </w:r>
+    </w:p>
+    <w:p>
+      <w:pPr>
+        <w:rPr>
+          <w:rFonts w:ascii="微软雅黑" w:eastAsia="微软雅黑" w:hAnsi="微软雅黑"/>
+          <w:lang w:eastAsia="zh-CN"/>
+        </w:rPr>
+      </w:pPr>
+      <w:r>
+        <w:rPr>
+          <w:rFonts w:ascii="微软雅黑" w:eastAsia="微软雅黑" w:hAnsi="微软雅黑"/>
+          <w:lang w:eastAsia="zh-CN"/>
+        </w:rPr>
+        <w:t>- 会议理解与结构化累积</w:t>
+      </w:r>
+    </w:p>
+    <w:p>
+      <w:pPr>
+        <w:rPr>
+          <w:rFonts w:ascii="微软雅黑" w:eastAsia="微软雅黑" w:hAnsi="微软雅黑"/>
+          <w:lang w:eastAsia="zh-CN"/>
+        </w:rPr>
+      </w:pPr>
+      <w:r>
+        <w:rPr>
+          <w:rFonts w:ascii="微软雅黑" w:eastAsia="微软雅黑" w:hAnsi="微软雅黑"/>
+          <w:lang w:eastAsia="zh-CN"/>
+        </w:rPr>
+        <w:t>- 需求分析(后台,hermes skill)</w:t>
+      </w:r>
+    </w:p>
+    <w:p>
+      <w:pPr>
+        <w:rPr>
+          <w:rFonts w:ascii="微软雅黑" w:eastAsia="微软雅黑" w:hAnsi="微软雅黑"/>
+          <w:lang w:eastAsia="zh-CN"/>
+        </w:rPr>
+      </w:pPr>
+      <w:r>
+        <w:rPr>
+          <w:rFonts w:ascii="微软雅黑" w:eastAsia="微软雅黑" w:hAnsi="微软雅黑"/>
+          <w:lang w:eastAsia="zh-CN"/>
+        </w:rPr>
+        <w:t>- 解释材料生成(后台,hermes skill)</w:t>
+      </w:r>
+    </w:p>
+    <w:p>
+      <w:pPr>
+        <w:rPr>
+          <w:rFonts w:ascii="微软雅黑" w:eastAsia="微软雅黑" w:hAnsi="微软雅黑"/>
+          <w:lang w:eastAsia="zh-CN"/>
+        </w:rPr>
+      </w:pPr>
+      <w:r>
+        <w:rPr>
+          <w:rFonts w:ascii="微软雅黑" w:eastAsia="微软雅黑" w:hAnsi="微软雅黑"/>
+          <w:lang w:eastAsia="zh-CN"/>
+        </w:rPr>
+        <w:t>- Sub-agent并行推理(后台,hermes delegate_task)</w:t>
+      </w:r>
+    </w:p>
+    <w:p>
+      <w:pPr>
+        <w:rPr>
+          <w:rFonts w:ascii="微软雅黑" w:eastAsia="微软雅黑" w:hAnsi="微软雅黑"/>
+          <w:lang w:eastAsia="zh-CN"/>
+        </w:rPr>
+      </w:pPr>
+      <w:r>
+        <w:rPr>
+          <w:rFonts w:ascii="微软雅黑" w:eastAsia="微软雅黑" w:hAnsi="微软雅黑"/>
+          <w:lang w:eastAsia="zh-CN"/>
+        </w:rPr>
+        <w:t>- 交互Demo与交付物持续生成(后台并行,VP 调取即用;**可选生产模式**:VP 显式启用后,会议结束自动转生产:导出代码 + 推 GitHub + 部署测试)</w:t>
+      </w:r>
+    </w:p>
+    <w:p>
+      <w:pPr>
+        <w:rPr>
+          <w:rFonts w:ascii="微软雅黑" w:eastAsia="微软雅黑" w:hAnsi="微软雅黑"/>
+          <w:lang w:eastAsia="zh-CN"/>
+        </w:rPr>
+      </w:pPr>
+      <w:r>
+        <w:rPr>
+          <w:rFonts w:ascii="微软雅黑" w:eastAsia="微软雅黑" w:hAnsi="微软雅黑"/>
+          <w:lang w:eastAsia="zh-CN"/>
+        </w:rPr>
+        <w:t>- 企业/个人/行业知识库调用(hermes memory 持久化,跨会议连续)</w:t>
+      </w:r>
+    </w:p>
+    <w:p>
+      <w:pPr>
+        <w:rPr>
+          <w:rFonts w:ascii="微软雅黑" w:eastAsia="微软雅黑" w:hAnsi="微软雅黑"/>
+          <w:lang w:eastAsia="zh-CN"/>
+        </w:rPr>
+      </w:pPr>
+      <w:r>
+        <w:rPr>
+          <w:rFonts w:ascii="微软雅黑" w:eastAsia="微软雅黑" w:hAnsi="微软雅黑"/>
+          <w:lang w:eastAsia="zh-CN"/>
+        </w:rPr>
+        <w:t>- 软件交付资产持续累积+生成(后台并行);所有能力作为 **hermes skill 集合**实现,自动生成/复用/版本化</w:t>
+      </w:r>
+    </w:p>
+    <w:p>
+      <w:pPr>
+        <w:rPr>
+          <w:rFonts w:ascii="微软雅黑" w:eastAsia="微软雅黑" w:hAnsi="微软雅黑"/>
+          <w:lang w:eastAsia="zh-CN"/>
+        </w:rPr>
+      </w:pPr>
+    </w:p>
+    <w:p>
+      <w:pPr>
+        <w:rPr>
+          <w:rFonts w:ascii="微软雅黑" w:eastAsia="微软雅黑" w:hAnsi="微软雅黑"/>
+          <w:lang w:eastAsia="zh-CN"/>
+        </w:rPr>
+      </w:pPr>
+      <w:r>
+        <w:rPr>
+          <w:rFonts w:ascii="微软雅黑" w:eastAsia="微软雅黑" w:hAnsi="微软雅黑"/>
+          <w:lang w:eastAsia="zh-CN"/>
+        </w:rPr>
+        <w:t>核心定义：</w:t>
+      </w:r>
+    </w:p>
+    <w:p>
+      <w:pPr>
+        <w:rPr>
+          <w:rFonts w:ascii="微软雅黑" w:eastAsia="微软雅黑" w:hAnsi="微软雅黑"/>
+          <w:lang w:eastAsia="zh-CN"/>
+        </w:rPr>
+      </w:pPr>
+      <w:r>
+        <w:rPr>
+          <w:rFonts w:ascii="微软雅黑" w:eastAsia="微软雅黑" w:hAnsi="微软雅黑"/>
+          <w:lang w:eastAsia="zh-CN"/>
+        </w:rPr>
+        <w:t>会议 = 人机协同过程</w:t>
+      </w:r>
+    </w:p>
+    <w:p>
+      <w:pPr>
+        <w:rPr>
+          <w:rFonts w:ascii="微软雅黑" w:eastAsia="微软雅黑" w:hAnsi="微软雅黑"/>
+          <w:lang w:eastAsia="zh-CN"/>
+        </w:rPr>
+      </w:pPr>
       <w:proofErr w:type="spellStart"/>
       <w:r>
         <w:rPr>
           <w:rFonts w:ascii="微软雅黑" w:eastAsia="微软雅黑" w:hAnsi="微软雅黑"/>
           <w:lang w:eastAsia="zh-CN"/>
         </w:rPr>
+        <w:t>VPBuddy = 会议中的AI协同执行系统(运行在 Hermes Agent 之上,会议 = hermes session,系列会议上下文自动接上)</w:t>
       </w:r>
       <w:proofErr w:type="spellEnd"/>
       <w:r>
@@ -185,174 +350,6 @@
           <w:rFonts w:ascii="微软雅黑" w:eastAsia="微软雅黑" w:hAnsi="微软雅黑"/>
           <w:lang w:eastAsia="zh-CN"/>
         </w:rPr>
-      </w:r>
-    </w:p>
-    <w:p>
-      <w:pPr>
-        <w:rPr>
-          <w:rFonts w:ascii="微软雅黑" w:eastAsia="微软雅黑" w:hAnsi="微软雅黑"/>
-          <w:lang w:eastAsia="zh-CN"/>
-        </w:rPr>
-      </w:pPr>
-      <w:r>
-        <w:rPr>
-          <w:rFonts w:ascii="微软雅黑" w:eastAsia="微软雅黑" w:hAnsi="微软雅黑"/>
-          <w:lang w:eastAsia="zh-CN"/>
-        </w:rPr>
-        <w:t>- 会议理解与结构化累积</w:t>
-      </w:r>
-    </w:p>
-    <w:p>
-      <w:pPr>
-        <w:rPr>
-          <w:rFonts w:ascii="微软雅黑" w:eastAsia="微软雅黑" w:hAnsi="微软雅黑"/>
-          <w:lang w:eastAsia="zh-CN"/>
-        </w:rPr>
-      </w:pPr>
-      <w:r>
-        <w:rPr>
-          <w:rFonts w:ascii="微软雅黑" w:eastAsia="微软雅黑" w:hAnsi="微软雅黑"/>
-          <w:lang w:eastAsia="zh-CN"/>
-        </w:rPr>
-        <w:t>- 需求分析(后台)</w:t>
-      </w:r>
-    </w:p>
-    <w:p>
-      <w:pPr>
-        <w:rPr>
-          <w:rFonts w:ascii="微软雅黑" w:eastAsia="微软雅黑" w:hAnsi="微软雅黑"/>
-          <w:lang w:eastAsia="zh-CN"/>
-        </w:rPr>
-      </w:pPr>
-      <w:r>
-        <w:rPr>
-          <w:rFonts w:ascii="微软雅黑" w:eastAsia="微软雅黑" w:hAnsi="微软雅黑"/>
-          <w:lang w:eastAsia="zh-CN"/>
-        </w:rPr>
-        <w:t>- 解释材料生成(后台)</w:t>
-      </w:r>
-    </w:p>
-    <w:p>
-      <w:pPr>
-        <w:rPr>
-          <w:rFonts w:ascii="微软雅黑" w:eastAsia="微软雅黑" w:hAnsi="微软雅黑"/>
-          <w:lang w:eastAsia="zh-CN"/>
-        </w:rPr>
-      </w:pPr>
-      <w:r>
-        <w:rPr>
-          <w:rFonts w:ascii="微软雅黑" w:eastAsia="微软雅黑" w:hAnsi="微软雅黑"/>
-          <w:lang w:eastAsia="zh-CN"/>
-        </w:rPr>
-        <w:t>- Sub-agent并行推理(后台)</w:t>
-      </w:r>
-    </w:p>
-    <w:p>
-      <w:pPr>
-        <w:rPr>
-          <w:rFonts w:ascii="微软雅黑" w:eastAsia="微软雅黑" w:hAnsi="微软雅黑"/>
-          <w:lang w:eastAsia="zh-CN"/>
-        </w:rPr>
-      </w:pPr>
-      <w:r>
-        <w:rPr>
-          <w:rFonts w:ascii="微软雅黑" w:eastAsia="微软雅黑" w:hAnsi="微软雅黑"/>
-          <w:lang w:eastAsia="zh-CN"/>
-        </w:rPr>
-        <w:t>- 交互Demo与交付物持续生成(后台并行,VP 调取即用)</w:t>
-      </w:r>
-    </w:p>
-    <w:p>
-      <w:pPr>
-        <w:rPr>
-          <w:rFonts w:ascii="微软雅黑" w:eastAsia="微软雅黑" w:hAnsi="微软雅黑"/>
-          <w:lang w:eastAsia="zh-CN"/>
-        </w:rPr>
-      </w:pPr>
-      <w:r>
-        <w:rPr>
-          <w:rFonts w:ascii="微软雅黑" w:eastAsia="微软雅黑" w:hAnsi="微软雅黑"/>
-          <w:lang w:eastAsia="zh-CN"/>
-        </w:rPr>
-        <w:t>- 企业/个人/行业知识库调用</w:t>
-      </w:r>
-    </w:p>
-    <w:p>
-      <w:pPr>
-        <w:rPr>
-          <w:rFonts w:ascii="微软雅黑" w:eastAsia="微软雅黑" w:hAnsi="微软雅黑"/>
-          <w:lang w:eastAsia="zh-CN"/>
-        </w:rPr>
-      </w:pPr>
-      <w:r>
-        <w:rPr>
-          <w:rFonts w:ascii="微软雅黑" w:eastAsia="微软雅黑" w:hAnsi="微软雅黑"/>
-          <w:lang w:eastAsia="zh-CN"/>
-        </w:rPr>
-        <w:t>- 软件交付资产持续累积+生成(后台并行)</w:t>
-      </w:r>
-    </w:p>
-    <w:p>
-      <w:pPr>
-        <w:rPr>
-          <w:rFonts w:ascii="微软雅黑" w:eastAsia="微软雅黑" w:hAnsi="微软雅黑"/>
-          <w:lang w:eastAsia="zh-CN"/>
-        </w:rPr>
-      </w:pPr>
-    </w:p>
-    <w:p>
-      <w:pPr>
-        <w:rPr>
-          <w:rFonts w:ascii="微软雅黑" w:eastAsia="微软雅黑" w:hAnsi="微软雅黑"/>
-          <w:lang w:eastAsia="zh-CN"/>
-        </w:rPr>
-      </w:pPr>
-      <w:r>
-        <w:rPr>
-          <w:rFonts w:ascii="微软雅黑" w:eastAsia="微软雅黑" w:hAnsi="微软雅黑"/>
-          <w:lang w:eastAsia="zh-CN"/>
-        </w:rPr>
-        <w:t>核心定义：</w:t>
-      </w:r>
-    </w:p>
-    <w:p>
-      <w:pPr>
-        <w:rPr>
-          <w:rFonts w:ascii="微软雅黑" w:eastAsia="微软雅黑" w:hAnsi="微软雅黑"/>
-          <w:lang w:eastAsia="zh-CN"/>
-        </w:rPr>
-      </w:pPr>
-      <w:r>
-        <w:rPr>
-          <w:rFonts w:ascii="微软雅黑" w:eastAsia="微软雅黑" w:hAnsi="微软雅黑"/>
-          <w:lang w:eastAsia="zh-CN"/>
-        </w:rPr>
-        <w:t>会议 = 人机协同过程</w:t>
-      </w:r>
-    </w:p>
-    <w:p>
-      <w:pPr>
-        <w:rPr>
-          <w:rFonts w:ascii="微软雅黑" w:eastAsia="微软雅黑" w:hAnsi="微软雅黑"/>
-          <w:lang w:eastAsia="zh-CN"/>
-        </w:rPr>
-      </w:pPr>
-      <w:proofErr w:type="spellStart"/>
-      <w:r>
-        <w:rPr>
-          <w:rFonts w:ascii="微软雅黑" w:eastAsia="微软雅黑" w:hAnsi="微软雅黑"/>
-          <w:lang w:eastAsia="zh-CN"/>
-        </w:rPr>
-        <w:lastRenderedPageBreak/>
-        <w:t>VPBuddy</w:t>
-      </w:r>
-      <w:proofErr w:type="spellEnd"/>
-      <w:r>
-        <w:rPr>
-          <w:rFonts w:ascii="微软雅黑" w:eastAsia="微软雅黑" w:hAnsi="微软雅黑"/>
-          <w:lang w:eastAsia="zh-CN"/>
-        </w:rPr>
-        <w:t xml:space="preserve"> = 会议中的AI协同执行系统</w:t>
       </w:r>
     </w:p>
     <w:p>

</xml_diff>

<commit_message>
docs: v1.8/v1.7 同步 - VPBuddy_产品说明书.docx
</commit_message>
<xml_diff>
--- a/docs/product-spec/VPBuddy_产品说明书.docx
+++ b/docs/product-spec/VPBuddy_产品说明书.docx
@@ -1279,7 +1279,7 @@
           <w:rFonts w:ascii="微软雅黑" w:eastAsia="微软雅黑" w:hAnsi="微软雅黑"/>
           <w:lang w:eastAsia="zh-CN"/>
         </w:rPr>
-        <w:t>本质:**方向盘式引导**(v1.5 改),不是"批改已完成的成果";VP 在过程中持续 steer,AI 持续整合,投屏/外发是 VP 想看/想发的时刻,不是"完成"标志</w:t>
+        <w:t>本质:**方向盘式引导**(v1.5 改),不是"批改已完成的成果";VP 在过程中持续 steer,AI 持续整合。**外发** = VP 想把当前状态导出/发送;**投屏** = 会议平台原生屏幕共享功能(腾讯/飞书/Zoom 都有),VPBuddy 不实现投屏本身,只提供按钮触发会议 SDK</w:t>
       </w:r>
     </w:p>
     <w:p>
@@ -2187,6 +2187,11 @@
     <w:p>
       <w:r>
         <w:t>VP 任何时候投屏/外发(无『完成』前提)</w:t>
+      </w:r>
+    </w:p>
+    <w:p>
+      <w:r>
+        <w:t>Session 生命周期感知(v1.7 新增):steer 之前必须检查 hermes session 状态:① idle 自动启动+排队 ② active 直接处理 ③ completed 提示 VP"会议已结束,新开会/续会?" ④ reactivated 续会正常处理。**关键**:不让 VP 看到 hermes 内部错误,VPBuddy 全部转成"人话"</w:t>
       </w:r>
     </w:p>
     <w:sectPr>

</xml_diff>

<commit_message>
docs: v1.9/v1.8 同步 - VPBuddy_产品说明书.docx
</commit_message>
<xml_diff>
--- a/docs/product-spec/VPBuddy_产品说明书.docx
+++ b/docs/product-spec/VPBuddy_产品说明书.docx
@@ -2187,11 +2187,6 @@
     <w:p>
       <w:r>
         <w:t>VP 任何时候投屏/外发(无『完成』前提)</w:t>
-      </w:r>
-    </w:p>
-    <w:p>
-      <w:r>
-        <w:t>Session 生命周期感知(v1.7 新增):steer 之前必须检查 hermes session 状态:① idle 自动启动+排队 ② active 直接处理 ③ completed 提示 VP"会议已结束,新开会/续会?" ④ reactivated 续会正常处理。**关键**:不让 VP 看到 hermes 内部错误,VPBuddy 全部转成"人话"</w:t>
       </w:r>
     </w:p>
     <w:sectPr>

</xml_diff>

<commit_message>
docs: v1.11/v1.10 同步 - VPBuddy_产品说明书.docx
</commit_message>
<xml_diff>
--- a/docs/product-spec/VPBuddy_产品说明书.docx
+++ b/docs/product-spec/VPBuddy_产品说明书.docx
@@ -62,7 +62,7 @@
           <w:rFonts w:ascii="微软雅黑" w:eastAsia="微软雅黑" w:hAnsi="微软雅黑"/>
           <w:lang w:eastAsia="zh-CN"/>
         </w:rPr>
-        <w:t>VPBuddy 是面向软件开发公司 VP / 售前负责人 / 项目负责人的 人机协同会议操作系统级 AI 助手,**运行在 Hermes Agent 之上**(v1.6 新增底层说明)。一个会议 = Hermes 一个 session,系列会议 = 同一 session 持续。</w:t>
+        <w:t>VPBuddy 是面向软件开发公司 VP / 售前负责人 / 项目负责人的 人机协同会议操作系统级 AI 助手,**运行在 Hermes Agent 之上**(v1.6 新增底层说明)。一个会议 = Hermes 一个 session,系列会议 = 同一 session 持续。**v1.10 新增**: 两个为 VP 服务的主动推送能力——**疑问窗口**(AI 主动问 VP 没听清/有矛盾/需要确认的地方)和**预准备内容**(AI 主动准备客户可能要问的弹药,VP 决定用不用)</w:t>
       </w:r>
       <w:proofErr w:type="spellEnd"/>
       <w:r>
@@ -258,7 +258,7 @@
           <w:rFonts w:ascii="微软雅黑" w:eastAsia="微软雅黑" w:hAnsi="微软雅黑"/>
           <w:lang w:eastAsia="zh-CN"/>
         </w:rPr>
-        <w:t>- 交互Demo与交付物持续生成(后台并行,VP 调取即用;**可选生产模式**:VP 显式启用后,会议结束自动转生产:导出代码 + 推 GitHub + 部署测试)</w:t>
+        <w:t>- 交互Demo与交付物持续生成(后台并行,VP 调取即用;**可选生产模式**:VP 显式启用后,会议结束自动转生产:导出代码 + 推 GitHub + 部署测试);**v1.10 新增**: 疑问窗口(AI 主动问 VP)+ 预准备内容(AI 主动为 VP 准备弹药)</w:t>
       </w:r>
     </w:p>
     <w:p>
@@ -1279,7 +1279,7 @@
           <w:rFonts w:ascii="微软雅黑" w:eastAsia="微软雅黑" w:hAnsi="微软雅黑"/>
           <w:lang w:eastAsia="zh-CN"/>
         </w:rPr>
-        <w:t>本质:**方向盘式引导**(v1.5 改),不是"批改已完成的成果";VP 在过程中持续 steer,AI 持续整合。**外发** = VP 想把当前状态导出/发送(VPBuddy 处理);**投屏** = VP 在会议客户端自己点"共享屏幕"(腾讯/飞书/Zoom 都有),**VPBuddy 不参与**——投屏是会议平台的事</w:t>
+        <w:t>本质:**方向盘式引导**(v1.5 改),不是"批改已完成的成果";VP 在过程中持续 steer,AI 持续整合。**v1.10 新增**两个为 VP 服务的主动推送(不是"推结果"): ① **疑问窗口**(AI 主动问 VP,持续听,识别模糊/矛盾/未澄清,生成疑问列表按紧急度排序) ② **预准备内容**(AI 主动准备客户可能问的问题 + 答案,VP 决定用不用)。**外发** = VP 想把当前状态导出/发送(VPBuddy 处理);**投屏** = VP 在会议客户端自己点"共享屏幕",**VPBuddy 不参与**</w:t>
       </w:r>
     </w:p>
     <w:p>

</xml_diff>

<commit_message>
docs: v1.12/v1.11 同步 - VPBuddy_产品说明书.docx
</commit_message>
<xml_diff>
--- a/docs/product-spec/VPBuddy_产品说明书.docx
+++ b/docs/product-spec/VPBuddy_产品说明书.docx
@@ -607,7 +607,7 @@
           <w:rFonts w:ascii="微软雅黑" w:eastAsia="微软雅黑" w:hAnsi="微软雅黑"/>
           <w:lang w:eastAsia="zh-CN"/>
         </w:rPr>
-        <w:t>功能：会议入口与系统初始化</w:t>
+        <w:t>功能:会议入口与系统初始化;**v1.11 重大简化:默认用会议平台原生 ASR/转写**(带说话人识别,飞书妙记/腾讯 AI/Zoom AI Companion/钉钉智能会议都已支持),VPBuddy 不自实现 ASR</w:t>
       </w:r>
     </w:p>
     <w:p>
@@ -652,38 +652,37 @@
           <w:rFonts w:ascii="微软雅黑" w:eastAsia="微软雅黑" w:hAnsi="微软雅黑"/>
           <w:lang w:eastAsia="zh-CN"/>
         </w:rPr>
-        <w:lastRenderedPageBreak/>
-        <w:t>- 加入会议</w:t>
-      </w:r>
-    </w:p>
-    <w:p>
-      <w:pPr>
-        <w:rPr>
-          <w:rFonts w:ascii="微软雅黑" w:eastAsia="微软雅黑" w:hAnsi="微软雅黑"/>
-          <w:lang w:eastAsia="zh-CN"/>
-        </w:rPr>
-      </w:pPr>
-      <w:r>
-        <w:rPr>
-          <w:rFonts w:ascii="微软雅黑" w:eastAsia="微软雅黑" w:hAnsi="微软雅黑"/>
-          <w:lang w:eastAsia="zh-CN"/>
-        </w:rPr>
-        <w:t>- 初始化语音/屏幕/文本解析</w:t>
-      </w:r>
-    </w:p>
-    <w:p>
-      <w:pPr>
-        <w:rPr>
-          <w:rFonts w:ascii="微软雅黑" w:eastAsia="微软雅黑" w:hAnsi="微软雅黑"/>
-          <w:lang w:eastAsia="zh-CN"/>
-        </w:rPr>
-      </w:pPr>
-      <w:r>
-        <w:rPr>
-          <w:rFonts w:ascii="微软雅黑" w:eastAsia="微软雅黑" w:hAnsi="微软雅黑"/>
-          <w:lang w:eastAsia="zh-CN"/>
-        </w:rPr>
-        <w:t>- 启动Agent系统</w:t>
+        <w:t>- 加入会议(通过平台 SDK)</w:t>
+      </w:r>
+    </w:p>
+    <w:p>
+      <w:pPr>
+        <w:rPr>
+          <w:rFonts w:ascii="微软雅黑" w:eastAsia="微软雅黑" w:hAnsi="微软雅黑"/>
+          <w:lang w:eastAsia="zh-CN"/>
+        </w:rPr>
+      </w:pPr>
+      <w:r>
+        <w:rPr>
+          <w:rFonts w:ascii="微软雅黑" w:eastAsia="微软雅黑" w:hAnsi="微软雅黑"/>
+          <w:lang w:eastAsia="zh-CN"/>
+        </w:rPr>
+        <w:t>- 初始化平台原生 ASR/转写通道(带说话人识别;**v1.11 新增**)</w:t>
+      </w:r>
+    </w:p>
+    <w:p>
+      <w:pPr>
+        <w:rPr>
+          <w:rFonts w:ascii="微软雅黑" w:eastAsia="微软雅黑" w:hAnsi="微软雅黑"/>
+          <w:lang w:eastAsia="zh-CN"/>
+        </w:rPr>
+      </w:pPr>
+      <w:r>
+        <w:rPr>
+          <w:rFonts w:ascii="微软雅黑" w:eastAsia="微软雅黑" w:hAnsi="微软雅黑"/>
+          <w:lang w:eastAsia="zh-CN"/>
+        </w:rPr>
+        <w:t>- 启动 Agent 系统</w:t>
       </w:r>
     </w:p>
     <w:p>
@@ -713,7 +712,7 @@
           <w:rFonts w:ascii="微软雅黑" w:eastAsia="微软雅黑" w:hAnsi="微软雅黑"/>
           <w:lang w:eastAsia="zh-CN"/>
         </w:rPr>
-        <w:t>- 创建会议工作台</w:t>
+        <w:t>- 创建会议工作台 + 启动后台 3 轨(累积/生成/疑问+预准备)</w:t>
       </w:r>
     </w:p>
     <w:p>
@@ -751,7 +750,7 @@
           <w:rFonts w:ascii="微软雅黑" w:eastAsia="微软雅黑" w:hAnsi="微软雅黑"/>
           <w:lang w:eastAsia="zh-CN"/>
         </w:rPr>
-        <w:t>会议持续累积结构化为(后台,无延迟约束):</w:t>
+        <w:t>会议持续累积结构化为(后台,无延迟约束;**来源:v1.11 起改用平台原生 ASR/转写,带说话人标签**):</w:t>
       </w:r>
     </w:p>
     <w:p>

</xml_diff>

<commit_message>
docs(product-spec): v1.12 - 双轨 ASR + 第一方案默认 Whisper 自接
</commit_message>
<xml_diff>
--- a/docs/product-spec/VPBuddy_产品说明书.docx
+++ b/docs/product-spec/VPBuddy_产品说明书.docx
@@ -9,6 +9,96 @@
           <w:lang w:eastAsia="zh-CN"/>
         </w:rPr>
       </w:pPr>
+      <w:r>
+        <w:t>VPBuddy 产品说明书(v1.12)</w:t>
+      </w:r>
+    </w:p>
+    <w:p>
+      <w:pPr>
+        <w:rPr>
+          <w:rFonts w:ascii="微软雅黑" w:eastAsia="微软雅黑" w:hAnsi="微软雅黑"/>
+          <w:lang w:eastAsia="zh-CN"/>
+        </w:rPr>
+      </w:pPr>
+    </w:p>
+    <w:p>
+      <w:pPr>
+        <w:rPr>
+          <w:rFonts w:ascii="微软雅黑" w:eastAsia="微软雅黑" w:hAnsi="微软雅黑"/>
+          <w:lang w:eastAsia="zh-CN"/>
+        </w:rPr>
+      </w:pPr>
+      <w:r>
+        <w:rPr>
+          <w:rFonts w:ascii="微软雅黑" w:eastAsia="微软雅黑" w:hAnsi="微软雅黑"/>
+          <w:lang w:eastAsia="zh-CN"/>
+        </w:rPr>
+        <w:t>一、产品定位</w:t>
+      </w:r>
+    </w:p>
+    <w:p>
+      <w:pPr>
+        <w:rPr>
+          <w:rFonts w:ascii="微软雅黑" w:eastAsia="微软雅黑" w:hAnsi="微软雅黑"/>
+          <w:lang w:eastAsia="zh-CN"/>
+        </w:rPr>
+      </w:pPr>
+      <w:r>
+        <w:t>VPBuddy 是面向软件开发公司 VP / 售前负责人 / 项目负责人的 人机协同会议操作系统级 AI 助手,**运行在 Hermes Agent 之上**(v1.6 新增底层说明)。一个会议 = Hermes 一个 session,系列会议 = 同一 session 持续。**v1.10 新增**: 两个为 VP 服务的主动推送能力——**疑问窗口**(AI 主动问 VP 没听清/有矛盾/需要确认的地方)和**预准备内容**(AI 主动准备客户可能要问的弹药,VP 决定用不用)。**v1.12 新增**: **双轨 ASR**——**第一方案默认 Whisper 自接 + pyannote**(VP 设备 loopback + 服务端 faster-whisper);**第二方案 Zoom RTMS**(英文);**第三方案小鱼易连企业版 API**(需 VPBuddy 签企业合作);**飞书妙记降为"会后校准源"**(跟 pyannote 融合提准确率)</w:t>
+      </w:r>
+    </w:p>
+    <w:p>
+      <w:pPr>
+        <w:rPr>
+          <w:rFonts w:ascii="微软雅黑" w:eastAsia="微软雅黑" w:hAnsi="微软雅黑"/>
+          <w:lang w:eastAsia="zh-CN"/>
+        </w:rPr>
+      </w:pPr>
+    </w:p>
+    <w:p>
+      <w:pPr>
+        <w:rPr>
+          <w:rFonts w:ascii="微软雅黑" w:eastAsia="微软雅黑" w:hAnsi="微软雅黑"/>
+          <w:lang w:eastAsia="zh-CN"/>
+        </w:rPr>
+      </w:pPr>
+      <w:r>
+        <w:rPr>
+          <w:rFonts w:ascii="微软雅黑" w:eastAsia="微软雅黑" w:hAnsi="微软雅黑"/>
+          <w:lang w:eastAsia="zh-CN"/>
+        </w:rPr>
+        <w:t>它不是传统意义上的AI助手，而是运行在会议中的协同系统：</w:t>
+      </w:r>
+    </w:p>
+    <w:p>
+      <w:pPr>
+        <w:rPr>
+          <w:rFonts w:ascii="微软雅黑" w:eastAsia="微软雅黑" w:hAnsi="微软雅黑"/>
+          <w:lang w:eastAsia="zh-CN"/>
+        </w:rPr>
+      </w:pPr>
+      <w:r>
+        <w:rPr>
+          <w:rFonts w:ascii="微软雅黑" w:eastAsia="微软雅黑" w:hAnsi="微软雅黑"/>
+          <w:lang w:eastAsia="zh-CN"/>
+        </w:rPr>
+        <w:t>- 人类负责决策与主导</w:t>
+      </w:r>
+    </w:p>
+    <w:p>
+      <w:pPr>
+        <w:rPr>
+          <w:rFonts w:ascii="微软雅黑" w:eastAsia="微软雅黑" w:hAnsi="微软雅黑"/>
+          <w:lang w:eastAsia="zh-CN"/>
+        </w:rPr>
+      </w:pPr>
+      <w:r>
+        <w:rPr>
+          <w:rFonts w:ascii="微软雅黑" w:eastAsia="微软雅黑" w:hAnsi="微软雅黑"/>
+          <w:lang w:eastAsia="zh-CN"/>
+        </w:rPr>
+        <w:t xml:space="preserve">- </w:t>
+      </w:r>
       <w:proofErr w:type="spellStart"/>
       <w:r>
         <w:rPr>
@@ -23,46 +113,45 @@
           <w:rFonts w:ascii="微软雅黑" w:eastAsia="微软雅黑" w:hAnsi="微软雅黑"/>
           <w:lang w:eastAsia="zh-CN"/>
         </w:rPr>
-        <w:t xml:space="preserve"> 产品说明书</w:t>
-      </w:r>
-    </w:p>
-    <w:p>
-      <w:pPr>
-        <w:rPr>
-          <w:rFonts w:ascii="微软雅黑" w:eastAsia="微软雅黑" w:hAnsi="微软雅黑"/>
-          <w:lang w:eastAsia="zh-CN"/>
-        </w:rPr>
-      </w:pPr>
-    </w:p>
-    <w:p>
-      <w:pPr>
-        <w:rPr>
-          <w:rFonts w:ascii="微软雅黑" w:eastAsia="微软雅黑" w:hAnsi="微软雅黑"/>
-          <w:lang w:eastAsia="zh-CN"/>
-        </w:rPr>
-      </w:pPr>
-      <w:r>
-        <w:rPr>
-          <w:rFonts w:ascii="微软雅黑" w:eastAsia="微软雅黑" w:hAnsi="微软雅黑"/>
-          <w:lang w:eastAsia="zh-CN"/>
-        </w:rPr>
-        <w:t>一、产品定位</w:t>
-      </w:r>
-    </w:p>
-    <w:p>
-      <w:pPr>
-        <w:rPr>
-          <w:rFonts w:ascii="微软雅黑" w:eastAsia="微软雅黑" w:hAnsi="微软雅黑"/>
-          <w:lang w:eastAsia="zh-CN"/>
-        </w:rPr>
-      </w:pPr>
+        <w:t>负责理解、结构化、生成与演化</w:t>
+      </w:r>
+    </w:p>
+    <w:p>
+      <w:pPr>
+        <w:rPr>
+          <w:rFonts w:ascii="微软雅黑" w:eastAsia="微软雅黑" w:hAnsi="微软雅黑"/>
+          <w:lang w:eastAsia="zh-CN"/>
+        </w:rPr>
+      </w:pPr>
+    </w:p>
+    <w:p>
+      <w:pPr>
+        <w:rPr>
+          <w:rFonts w:ascii="微软雅黑" w:eastAsia="微软雅黑" w:hAnsi="微软雅黑"/>
+          <w:lang w:eastAsia="zh-CN"/>
+        </w:rPr>
+      </w:pPr>
+      <w:proofErr w:type="gramStart"/>
+      <w:r>
+        <w:rPr>
+          <w:rFonts w:ascii="微软雅黑" w:eastAsia="微软雅黑" w:hAnsi="微软雅黑"/>
+          <w:lang w:eastAsia="zh-CN"/>
+        </w:rPr>
+        <w:t>在腾讯会议 / 飞书 / 钉钉 / Zoom 中,VPBuddy 后台并行做两件事:① 累积结构化信息(客户需求/业务目标/风险点),② 持续生成候选交付物(Demo/页面/数据模型/任务清单等)。VP 任何时候调取,都已有可投屏的候选交付物(由 hermes skill 持续生成):</w:t>
+      </w:r>
+      <w:proofErr w:type="gramEnd"/>
+      <w:r>
+        <w:rPr>
+          <w:rFonts w:ascii="微软雅黑" w:eastAsia="微软雅黑" w:hAnsi="微软雅黑"/>
+          <w:lang w:eastAsia="zh-CN"/>
+        </w:rPr>
+      </w:r>
       <w:proofErr w:type="spellStart"/>
       <w:r>
         <w:rPr>
           <w:rFonts w:ascii="微软雅黑" w:eastAsia="微软雅黑" w:hAnsi="微软雅黑"/>
           <w:lang w:eastAsia="zh-CN"/>
         </w:rPr>
-        <w:t>VPBuddy 是面向软件开发公司 VP / 售前负责人 / 项目负责人的 人机协同会议操作系统级 AI 助手,**运行在 Hermes Agent 之上**(v1.6 新增底层说明)。一个会议 = Hermes 一个 session,系列会议 = 同一 session 持续。**v1.10 新增**: 两个为 VP 服务的主动推送能力——**疑问窗口**(AI 主动问 VP 没听清/有矛盾/需要确认的地方)和**预准备内容**(AI 主动准备客户可能要问的弹药,VP 决定用不用)</w:t>
       </w:r>
       <w:proofErr w:type="spellEnd"/>
       <w:r>
@@ -79,57 +168,197 @@
           <w:lang w:eastAsia="zh-CN"/>
         </w:rPr>
       </w:pPr>
-    </w:p>
-    <w:p>
-      <w:pPr>
-        <w:rPr>
-          <w:rFonts w:ascii="微软雅黑" w:eastAsia="微软雅黑" w:hAnsi="微软雅黑"/>
-          <w:lang w:eastAsia="zh-CN"/>
-        </w:rPr>
-      </w:pPr>
-      <w:r>
-        <w:rPr>
-          <w:rFonts w:ascii="微软雅黑" w:eastAsia="微软雅黑" w:hAnsi="微软雅黑"/>
-          <w:lang w:eastAsia="zh-CN"/>
-        </w:rPr>
-        <w:t>它不是传统意义上的AI助手，而是运行在会议中的协同系统：</w:t>
-      </w:r>
-    </w:p>
-    <w:p>
-      <w:pPr>
-        <w:rPr>
-          <w:rFonts w:ascii="微软雅黑" w:eastAsia="微软雅黑" w:hAnsi="微软雅黑"/>
-          <w:lang w:eastAsia="zh-CN"/>
-        </w:rPr>
-      </w:pPr>
-      <w:r>
-        <w:rPr>
-          <w:rFonts w:ascii="微软雅黑" w:eastAsia="微软雅黑" w:hAnsi="微软雅黑"/>
-          <w:lang w:eastAsia="zh-CN"/>
-        </w:rPr>
-        <w:t>- 人类负责决策与主导</w:t>
-      </w:r>
-    </w:p>
-    <w:p>
-      <w:pPr>
-        <w:rPr>
-          <w:rFonts w:ascii="微软雅黑" w:eastAsia="微软雅黑" w:hAnsi="微软雅黑"/>
-          <w:lang w:eastAsia="zh-CN"/>
-        </w:rPr>
-      </w:pPr>
-      <w:r>
-        <w:rPr>
-          <w:rFonts w:ascii="微软雅黑" w:eastAsia="微软雅黑" w:hAnsi="微软雅黑"/>
-          <w:lang w:eastAsia="zh-CN"/>
-        </w:rPr>
-        <w:t xml:space="preserve">- </w:t>
-      </w:r>
+      <w:r>
+        <w:rPr>
+          <w:rFonts w:ascii="微软雅黑" w:eastAsia="微软雅黑" w:hAnsi="微软雅黑"/>
+          <w:lang w:eastAsia="zh-CN"/>
+        </w:rPr>
+        <w:t>- 会议理解与结构化累积</w:t>
+      </w:r>
+    </w:p>
+    <w:p>
+      <w:pPr>
+        <w:rPr>
+          <w:rFonts w:ascii="微软雅黑" w:eastAsia="微软雅黑" w:hAnsi="微软雅黑"/>
+          <w:lang w:eastAsia="zh-CN"/>
+        </w:rPr>
+      </w:pPr>
+      <w:r>
+        <w:rPr>
+          <w:rFonts w:ascii="微软雅黑" w:eastAsia="微软雅黑" w:hAnsi="微软雅黑"/>
+          <w:lang w:eastAsia="zh-CN"/>
+        </w:rPr>
+        <w:t>- 需求分析(后台,hermes skill)</w:t>
+      </w:r>
+    </w:p>
+    <w:p>
+      <w:pPr>
+        <w:rPr>
+          <w:rFonts w:ascii="微软雅黑" w:eastAsia="微软雅黑" w:hAnsi="微软雅黑"/>
+          <w:lang w:eastAsia="zh-CN"/>
+        </w:rPr>
+      </w:pPr>
+      <w:r>
+        <w:rPr>
+          <w:rFonts w:ascii="微软雅黑" w:eastAsia="微软雅黑" w:hAnsi="微软雅黑"/>
+          <w:lang w:eastAsia="zh-CN"/>
+        </w:rPr>
+        <w:t>- 解释材料生成(后台,hermes skill)</w:t>
+      </w:r>
+    </w:p>
+    <w:p>
+      <w:pPr>
+        <w:rPr>
+          <w:rFonts w:ascii="微软雅黑" w:eastAsia="微软雅黑" w:hAnsi="微软雅黑"/>
+          <w:lang w:eastAsia="zh-CN"/>
+        </w:rPr>
+      </w:pPr>
+      <w:r>
+        <w:rPr>
+          <w:rFonts w:ascii="微软雅黑" w:eastAsia="微软雅黑" w:hAnsi="微软雅黑"/>
+          <w:lang w:eastAsia="zh-CN"/>
+        </w:rPr>
+        <w:t>- Sub-agent并行推理(后台,hermes delegate_task)</w:t>
+      </w:r>
+    </w:p>
+    <w:p>
+      <w:pPr>
+        <w:rPr>
+          <w:rFonts w:ascii="微软雅黑" w:eastAsia="微软雅黑" w:hAnsi="微软雅黑"/>
+          <w:lang w:eastAsia="zh-CN"/>
+        </w:rPr>
+      </w:pPr>
+      <w:r>
+        <w:t>- 交互Demo与交付物持续生成(后台并行,VP 调取即用;**可选生产模式**:VP 显式启用后,会议结束自动转生产:导出代码 + 推 GitHub + 部署测试);**v1.10 新增**: 疑问窗口(AI 主动问 VP)+ 预准备内容(AI 主动为 VP 准备弹药);**v1.12 新增**: 双轨 ASR(Whisper 自接 + pyannote 默认 + 飞书 REST 会后校准)</w:t>
+      </w:r>
+    </w:p>
+    <w:p>
+      <w:pPr>
+        <w:rPr>
+          <w:rFonts w:ascii="微软雅黑" w:eastAsia="微软雅黑" w:hAnsi="微软雅黑"/>
+          <w:lang w:eastAsia="zh-CN"/>
+        </w:rPr>
+      </w:pPr>
+      <w:r>
+        <w:rPr>
+          <w:rFonts w:ascii="微软雅黑" w:eastAsia="微软雅黑" w:hAnsi="微软雅黑"/>
+          <w:lang w:eastAsia="zh-CN"/>
+        </w:rPr>
+        <w:t>- 企业/个人/行业知识库调用(hermes memory 持久化,跨会议连续)</w:t>
+      </w:r>
+    </w:p>
+    <w:p>
+      <w:pPr>
+        <w:rPr>
+          <w:rFonts w:ascii="微软雅黑" w:eastAsia="微软雅黑" w:hAnsi="微软雅黑"/>
+          <w:lang w:eastAsia="zh-CN"/>
+        </w:rPr>
+      </w:pPr>
+      <w:r>
+        <w:rPr>
+          <w:rFonts w:ascii="微软雅黑" w:eastAsia="微软雅黑" w:hAnsi="微软雅黑"/>
+          <w:lang w:eastAsia="zh-CN"/>
+        </w:rPr>
+        <w:t>- 软件交付资产持续累积+生成(后台并行);所有能力作为 **hermes skill 集合**实现,自动生成/复用/版本化</w:t>
+      </w:r>
+    </w:p>
+    <w:p>
+      <w:pPr>
+        <w:rPr>
+          <w:rFonts w:ascii="微软雅黑" w:eastAsia="微软雅黑" w:hAnsi="微软雅黑"/>
+          <w:lang w:eastAsia="zh-CN"/>
+        </w:rPr>
+      </w:pPr>
+    </w:p>
+    <w:p>
+      <w:pPr>
+        <w:rPr>
+          <w:rFonts w:ascii="微软雅黑" w:eastAsia="微软雅黑" w:hAnsi="微软雅黑"/>
+          <w:lang w:eastAsia="zh-CN"/>
+        </w:rPr>
+      </w:pPr>
+      <w:r>
+        <w:rPr>
+          <w:rFonts w:ascii="微软雅黑" w:eastAsia="微软雅黑" w:hAnsi="微软雅黑"/>
+          <w:lang w:eastAsia="zh-CN"/>
+        </w:rPr>
+        <w:t>核心定义：</w:t>
+      </w:r>
+    </w:p>
+    <w:p>
+      <w:pPr>
+        <w:rPr>
+          <w:rFonts w:ascii="微软雅黑" w:eastAsia="微软雅黑" w:hAnsi="微软雅黑"/>
+          <w:lang w:eastAsia="zh-CN"/>
+        </w:rPr>
+      </w:pPr>
+      <w:r>
+        <w:rPr>
+          <w:rFonts w:ascii="微软雅黑" w:eastAsia="微软雅黑" w:hAnsi="微软雅黑"/>
+          <w:lang w:eastAsia="zh-CN"/>
+        </w:rPr>
+        <w:t>会议 = 人机协同过程</w:t>
+      </w:r>
+    </w:p>
+    <w:p>
+      <w:pPr>
+        <w:rPr>
+          <w:rFonts w:ascii="微软雅黑" w:eastAsia="微软雅黑" w:hAnsi="微软雅黑"/>
+          <w:lang w:eastAsia="zh-CN"/>
+        </w:rPr>
+      </w:pPr>
       <w:proofErr w:type="spellStart"/>
       <w:r>
         <w:rPr>
           <w:rFonts w:ascii="微软雅黑" w:eastAsia="微软雅黑" w:hAnsi="微软雅黑"/>
           <w:lang w:eastAsia="zh-CN"/>
         </w:rPr>
+        <w:t>VPBuddy = 会议中的AI协同执行系统(运行在 Hermes Agent 之上,会议 = hermes session,系列会议上下文自动接上)</w:t>
+      </w:r>
+      <w:proofErr w:type="spellEnd"/>
+      <w:r>
+        <w:rPr>
+          <w:rFonts w:ascii="微软雅黑" w:eastAsia="微软雅黑" w:hAnsi="微软雅黑"/>
+          <w:lang w:eastAsia="zh-CN"/>
+        </w:rPr>
+      </w:r>
+    </w:p>
+    <w:p>
+      <w:pPr>
+        <w:rPr>
+          <w:rFonts w:ascii="微软雅黑" w:eastAsia="微软雅黑" w:hAnsi="微软雅黑"/>
+          <w:lang w:eastAsia="zh-CN"/>
+        </w:rPr>
+      </w:pPr>
+    </w:p>
+    <w:p>
+      <w:pPr>
+        <w:rPr>
+          <w:rFonts w:ascii="微软雅黑" w:eastAsia="微软雅黑" w:hAnsi="微软雅黑"/>
+          <w:lang w:eastAsia="zh-CN"/>
+        </w:rPr>
+      </w:pPr>
+      <w:r>
+        <w:rPr>
+          <w:rFonts w:ascii="微软雅黑" w:eastAsia="微软雅黑" w:hAnsi="微软雅黑"/>
+          <w:lang w:eastAsia="zh-CN"/>
+        </w:rPr>
+        <w:t>二、产品本质</w:t>
+      </w:r>
+    </w:p>
+    <w:p>
+      <w:pPr>
+        <w:rPr>
+          <w:rFonts w:ascii="微软雅黑" w:eastAsia="微软雅黑" w:hAnsi="微软雅黑"/>
+          <w:lang w:eastAsia="zh-CN"/>
+        </w:rPr>
+      </w:pPr>
+      <w:proofErr w:type="spellStart"/>
+      <w:r>
+        <w:rPr>
+          <w:rFonts w:ascii="微软雅黑" w:eastAsia="微软雅黑" w:hAnsi="微软雅黑"/>
+          <w:lang w:eastAsia="zh-CN"/>
+        </w:rPr>
         <w:t>VPBuddy</w:t>
       </w:r>
       <w:proofErr w:type="spellEnd"/>
@@ -138,45 +367,91 @@
           <w:rFonts w:ascii="微软雅黑" w:eastAsia="微软雅黑" w:hAnsi="微软雅黑"/>
           <w:lang w:eastAsia="zh-CN"/>
         </w:rPr>
-        <w:t>负责理解、结构化、生成与演化</w:t>
-      </w:r>
-    </w:p>
-    <w:p>
-      <w:pPr>
-        <w:rPr>
-          <w:rFonts w:ascii="微软雅黑" w:eastAsia="微软雅黑" w:hAnsi="微软雅黑"/>
-          <w:lang w:eastAsia="zh-CN"/>
-        </w:rPr>
-      </w:pPr>
-    </w:p>
-    <w:p>
-      <w:pPr>
-        <w:rPr>
-          <w:rFonts w:ascii="微软雅黑" w:eastAsia="微软雅黑" w:hAnsi="微软雅黑"/>
-          <w:lang w:eastAsia="zh-CN"/>
-        </w:rPr>
-      </w:pPr>
-      <w:proofErr w:type="gramStart"/>
-      <w:r>
-        <w:rPr>
-          <w:rFonts w:ascii="微软雅黑" w:eastAsia="微软雅黑" w:hAnsi="微软雅黑"/>
-          <w:lang w:eastAsia="zh-CN"/>
-        </w:rPr>
-        <w:t>在腾讯会议 / 飞书 / 钉钉 / Zoom 中,VPBuddy 后台并行做两件事:① 累积结构化信息(客户需求/业务目标/风险点),② 持续生成候选交付物(Demo/页面/数据模型/任务清单等)。VP 任何时候调取,都已有可投屏的候选交付物(由 hermes skill 持续生成):</w:t>
-      </w:r>
-      <w:proofErr w:type="gramEnd"/>
-      <w:r>
-        <w:rPr>
-          <w:rFonts w:ascii="微软雅黑" w:eastAsia="微软雅黑" w:hAnsi="微软雅黑"/>
-          <w:lang w:eastAsia="zh-CN"/>
-        </w:rPr>
-      </w:r>
+        <w:t>不是单纯AI助手，而是三层系统融合：</w:t>
+      </w:r>
+    </w:p>
+    <w:p>
+      <w:pPr>
+        <w:rPr>
+          <w:rFonts w:ascii="微软雅黑" w:eastAsia="微软雅黑" w:hAnsi="微软雅黑"/>
+          <w:lang w:eastAsia="zh-CN"/>
+        </w:rPr>
+      </w:pPr>
+      <w:r>
+        <w:rPr>
+          <w:rFonts w:ascii="微软雅黑" w:eastAsia="微软雅黑" w:hAnsi="微软雅黑"/>
+          <w:lang w:eastAsia="zh-CN"/>
+        </w:rPr>
+        <w:t>1. 人机协同助手（用户体验层）</w:t>
+      </w:r>
+    </w:p>
+    <w:p>
+      <w:pPr>
+        <w:rPr>
+          <w:rFonts w:ascii="微软雅黑" w:eastAsia="微软雅黑" w:hAnsi="微软雅黑"/>
+          <w:lang w:eastAsia="zh-CN"/>
+        </w:rPr>
+      </w:pPr>
+      <w:r>
+        <w:rPr>
+          <w:rFonts w:ascii="微软雅黑" w:eastAsia="微软雅黑" w:hAnsi="微软雅黑"/>
+          <w:lang w:eastAsia="zh-CN"/>
+        </w:rPr>
+        <w:t>2. 会议操作系统（产品能力层）</w:t>
+      </w:r>
+    </w:p>
+    <w:p>
+      <w:pPr>
+        <w:rPr>
+          <w:rFonts w:ascii="微软雅黑" w:eastAsia="微软雅黑" w:hAnsi="微软雅黑"/>
+          <w:lang w:eastAsia="zh-CN"/>
+        </w:rPr>
+      </w:pPr>
+      <w:r>
+        <w:rPr>
+          <w:rFonts w:ascii="微软雅黑" w:eastAsia="微软雅黑" w:hAnsi="微软雅黑"/>
+          <w:lang w:eastAsia="zh-CN"/>
+        </w:rPr>
+        <w:t>3. 软件需求持续累积引擎(技术本质层)</w:t>
+      </w:r>
+    </w:p>
+    <w:p>
+      <w:pPr>
+        <w:rPr>
+          <w:rFonts w:ascii="微软雅黑" w:eastAsia="微软雅黑" w:hAnsi="微软雅黑"/>
+          <w:lang w:eastAsia="zh-CN"/>
+        </w:rPr>
+      </w:pPr>
+    </w:p>
+    <w:p>
+      <w:pPr>
+        <w:rPr>
+          <w:rFonts w:ascii="微软雅黑" w:eastAsia="微软雅黑" w:hAnsi="微软雅黑"/>
+          <w:lang w:eastAsia="zh-CN"/>
+        </w:rPr>
+      </w:pPr>
+      <w:r>
+        <w:rPr>
+          <w:rFonts w:ascii="微软雅黑" w:eastAsia="微软雅黑" w:hAnsi="微软雅黑"/>
+          <w:lang w:eastAsia="zh-CN"/>
+        </w:rPr>
+        <w:t>三、系统结构</w:t>
+      </w:r>
+    </w:p>
+    <w:p>
+      <w:pPr>
+        <w:rPr>
+          <w:rFonts w:ascii="微软雅黑" w:eastAsia="微软雅黑" w:hAnsi="微软雅黑"/>
+          <w:lang w:eastAsia="zh-CN"/>
+        </w:rPr>
+      </w:pPr>
       <w:proofErr w:type="spellStart"/>
       <w:r>
         <w:rPr>
           <w:rFonts w:ascii="微软雅黑" w:eastAsia="微软雅黑" w:hAnsi="微软雅黑"/>
           <w:lang w:eastAsia="zh-CN"/>
         </w:rPr>
+        <w:t>VPBuddy</w:t>
       </w:r>
       <w:proofErr w:type="spellEnd"/>
       <w:r>
@@ -184,336 +459,32 @@
           <w:rFonts w:ascii="微软雅黑" w:eastAsia="微软雅黑" w:hAnsi="微软雅黑"/>
           <w:lang w:eastAsia="zh-CN"/>
         </w:rPr>
-      </w:r>
-    </w:p>
-    <w:p>
-      <w:pPr>
-        <w:rPr>
-          <w:rFonts w:ascii="微软雅黑" w:eastAsia="微软雅黑" w:hAnsi="微软雅黑"/>
-          <w:lang w:eastAsia="zh-CN"/>
-        </w:rPr>
-      </w:pPr>
-      <w:r>
-        <w:rPr>
-          <w:rFonts w:ascii="微软雅黑" w:eastAsia="微软雅黑" w:hAnsi="微软雅黑"/>
-          <w:lang w:eastAsia="zh-CN"/>
-        </w:rPr>
-        <w:t>- 会议理解与结构化累积</w:t>
-      </w:r>
-    </w:p>
-    <w:p>
-      <w:pPr>
-        <w:rPr>
-          <w:rFonts w:ascii="微软雅黑" w:eastAsia="微软雅黑" w:hAnsi="微软雅黑"/>
-          <w:lang w:eastAsia="zh-CN"/>
-        </w:rPr>
-      </w:pPr>
-      <w:r>
-        <w:rPr>
-          <w:rFonts w:ascii="微软雅黑" w:eastAsia="微软雅黑" w:hAnsi="微软雅黑"/>
-          <w:lang w:eastAsia="zh-CN"/>
-        </w:rPr>
-        <w:t>- 需求分析(后台,hermes skill)</w:t>
-      </w:r>
-    </w:p>
-    <w:p>
-      <w:pPr>
-        <w:rPr>
-          <w:rFonts w:ascii="微软雅黑" w:eastAsia="微软雅黑" w:hAnsi="微软雅黑"/>
-          <w:lang w:eastAsia="zh-CN"/>
-        </w:rPr>
-      </w:pPr>
-      <w:r>
-        <w:rPr>
-          <w:rFonts w:ascii="微软雅黑" w:eastAsia="微软雅黑" w:hAnsi="微软雅黑"/>
-          <w:lang w:eastAsia="zh-CN"/>
-        </w:rPr>
-        <w:t>- 解释材料生成(后台,hermes skill)</w:t>
-      </w:r>
-    </w:p>
-    <w:p>
-      <w:pPr>
-        <w:rPr>
-          <w:rFonts w:ascii="微软雅黑" w:eastAsia="微软雅黑" w:hAnsi="微软雅黑"/>
-          <w:lang w:eastAsia="zh-CN"/>
-        </w:rPr>
-      </w:pPr>
-      <w:r>
-        <w:rPr>
-          <w:rFonts w:ascii="微软雅黑" w:eastAsia="微软雅黑" w:hAnsi="微软雅黑"/>
-          <w:lang w:eastAsia="zh-CN"/>
-        </w:rPr>
-        <w:t>- Sub-agent并行推理(后台,hermes delegate_task)</w:t>
-      </w:r>
-    </w:p>
-    <w:p>
-      <w:pPr>
-        <w:rPr>
-          <w:rFonts w:ascii="微软雅黑" w:eastAsia="微软雅黑" w:hAnsi="微软雅黑"/>
-          <w:lang w:eastAsia="zh-CN"/>
-        </w:rPr>
-      </w:pPr>
-      <w:r>
-        <w:rPr>
-          <w:rFonts w:ascii="微软雅黑" w:eastAsia="微软雅黑" w:hAnsi="微软雅黑"/>
-          <w:lang w:eastAsia="zh-CN"/>
-        </w:rPr>
-        <w:t>- 交互Demo与交付物持续生成(后台并行,VP 调取即用;**可选生产模式**:VP 显式启用后,会议结束自动转生产:导出代码 + 推 GitHub + 部署测试);**v1.10 新增**: 疑问窗口(AI 主动问 VP)+ 预准备内容(AI 主动为 VP 准备弹药)</w:t>
-      </w:r>
-    </w:p>
-    <w:p>
-      <w:pPr>
-        <w:rPr>
-          <w:rFonts w:ascii="微软雅黑" w:eastAsia="微软雅黑" w:hAnsi="微软雅黑"/>
-          <w:lang w:eastAsia="zh-CN"/>
-        </w:rPr>
-      </w:pPr>
-      <w:r>
-        <w:rPr>
-          <w:rFonts w:ascii="微软雅黑" w:eastAsia="微软雅黑" w:hAnsi="微软雅黑"/>
-          <w:lang w:eastAsia="zh-CN"/>
-        </w:rPr>
-        <w:t>- 企业/个人/行业知识库调用(hermes memory 持久化,跨会议连续)</w:t>
-      </w:r>
-    </w:p>
-    <w:p>
-      <w:pPr>
-        <w:rPr>
-          <w:rFonts w:ascii="微软雅黑" w:eastAsia="微软雅黑" w:hAnsi="微软雅黑"/>
-          <w:lang w:eastAsia="zh-CN"/>
-        </w:rPr>
-      </w:pPr>
-      <w:r>
-        <w:rPr>
-          <w:rFonts w:ascii="微软雅黑" w:eastAsia="微软雅黑" w:hAnsi="微软雅黑"/>
-          <w:lang w:eastAsia="zh-CN"/>
-        </w:rPr>
-        <w:t>- 软件交付资产持续累积+生成(后台并行);所有能力作为 **hermes skill 集合**实现,自动生成/复用/版本化</w:t>
-      </w:r>
-    </w:p>
-    <w:p>
-      <w:pPr>
-        <w:rPr>
-          <w:rFonts w:ascii="微软雅黑" w:eastAsia="微软雅黑" w:hAnsi="微软雅黑"/>
-          <w:lang w:eastAsia="zh-CN"/>
-        </w:rPr>
-      </w:pPr>
-    </w:p>
-    <w:p>
-      <w:pPr>
-        <w:rPr>
-          <w:rFonts w:ascii="微软雅黑" w:eastAsia="微软雅黑" w:hAnsi="微软雅黑"/>
-          <w:lang w:eastAsia="zh-CN"/>
-        </w:rPr>
-      </w:pPr>
-      <w:r>
-        <w:rPr>
-          <w:rFonts w:ascii="微软雅黑" w:eastAsia="微软雅黑" w:hAnsi="微软雅黑"/>
-          <w:lang w:eastAsia="zh-CN"/>
-        </w:rPr>
-        <w:t>核心定义：</w:t>
-      </w:r>
-    </w:p>
-    <w:p>
-      <w:pPr>
-        <w:rPr>
-          <w:rFonts w:ascii="微软雅黑" w:eastAsia="微软雅黑" w:hAnsi="微软雅黑"/>
-          <w:lang w:eastAsia="zh-CN"/>
-        </w:rPr>
-      </w:pPr>
-      <w:r>
-        <w:rPr>
-          <w:rFonts w:ascii="微软雅黑" w:eastAsia="微软雅黑" w:hAnsi="微软雅黑"/>
-          <w:lang w:eastAsia="zh-CN"/>
-        </w:rPr>
-        <w:t>会议 = 人机协同过程</w:t>
-      </w:r>
-    </w:p>
-    <w:p>
-      <w:pPr>
-        <w:rPr>
-          <w:rFonts w:ascii="微软雅黑" w:eastAsia="微软雅黑" w:hAnsi="微软雅黑"/>
-          <w:lang w:eastAsia="zh-CN"/>
-        </w:rPr>
-      </w:pPr>
+        <w:t>由五大系统组成：</w:t>
+      </w:r>
+    </w:p>
+    <w:p>
+      <w:pPr>
+        <w:rPr>
+          <w:rFonts w:ascii="微软雅黑" w:eastAsia="微软雅黑" w:hAnsi="微软雅黑"/>
+        </w:rPr>
+      </w:pPr>
+      <w:r>
+        <w:rPr>
+          <w:rFonts w:ascii="微软雅黑" w:eastAsia="微软雅黑" w:hAnsi="微软雅黑"/>
+        </w:rPr>
+        <w:t xml:space="preserve">1. </w:t>
+      </w:r>
       <w:proofErr w:type="spellStart"/>
       <w:r>
         <w:rPr>
           <w:rFonts w:ascii="微软雅黑" w:eastAsia="微软雅黑" w:hAnsi="微软雅黑"/>
-          <w:lang w:eastAsia="zh-CN"/>
-        </w:rPr>
-        <w:t>VPBuddy = 会议中的AI协同执行系统(运行在 Hermes Agent 之上,会议 = hermes session,系列会议上下文自动接上)</w:t>
+        </w:rPr>
+        <w:t>会议接入层（Join</w:t>
       </w:r>
       <w:proofErr w:type="spellEnd"/>
       <w:r>
         <w:rPr>
           <w:rFonts w:ascii="微软雅黑" w:eastAsia="微软雅黑" w:hAnsi="微软雅黑"/>
-          <w:lang w:eastAsia="zh-CN"/>
-        </w:rPr>
-      </w:r>
-    </w:p>
-    <w:p>
-      <w:pPr>
-        <w:rPr>
-          <w:rFonts w:ascii="微软雅黑" w:eastAsia="微软雅黑" w:hAnsi="微软雅黑"/>
-          <w:lang w:eastAsia="zh-CN"/>
-        </w:rPr>
-      </w:pPr>
-    </w:p>
-    <w:p>
-      <w:pPr>
-        <w:rPr>
-          <w:rFonts w:ascii="微软雅黑" w:eastAsia="微软雅黑" w:hAnsi="微软雅黑"/>
-          <w:lang w:eastAsia="zh-CN"/>
-        </w:rPr>
-      </w:pPr>
-      <w:r>
-        <w:rPr>
-          <w:rFonts w:ascii="微软雅黑" w:eastAsia="微软雅黑" w:hAnsi="微软雅黑"/>
-          <w:lang w:eastAsia="zh-CN"/>
-        </w:rPr>
-        <w:t>二、产品本质</w:t>
-      </w:r>
-    </w:p>
-    <w:p>
-      <w:pPr>
-        <w:rPr>
-          <w:rFonts w:ascii="微软雅黑" w:eastAsia="微软雅黑" w:hAnsi="微软雅黑"/>
-          <w:lang w:eastAsia="zh-CN"/>
-        </w:rPr>
-      </w:pPr>
-      <w:proofErr w:type="spellStart"/>
-      <w:r>
-        <w:rPr>
-          <w:rFonts w:ascii="微软雅黑" w:eastAsia="微软雅黑" w:hAnsi="微软雅黑"/>
-          <w:lang w:eastAsia="zh-CN"/>
-        </w:rPr>
-        <w:t>VPBuddy</w:t>
-      </w:r>
-      <w:proofErr w:type="spellEnd"/>
-      <w:r>
-        <w:rPr>
-          <w:rFonts w:ascii="微软雅黑" w:eastAsia="微软雅黑" w:hAnsi="微软雅黑"/>
-          <w:lang w:eastAsia="zh-CN"/>
-        </w:rPr>
-        <w:t>不是单纯AI助手，而是三层系统融合：</w:t>
-      </w:r>
-    </w:p>
-    <w:p>
-      <w:pPr>
-        <w:rPr>
-          <w:rFonts w:ascii="微软雅黑" w:eastAsia="微软雅黑" w:hAnsi="微软雅黑"/>
-          <w:lang w:eastAsia="zh-CN"/>
-        </w:rPr>
-      </w:pPr>
-      <w:r>
-        <w:rPr>
-          <w:rFonts w:ascii="微软雅黑" w:eastAsia="微软雅黑" w:hAnsi="微软雅黑"/>
-          <w:lang w:eastAsia="zh-CN"/>
-        </w:rPr>
-        <w:t>1. 人机协同助手（用户体验层）</w:t>
-      </w:r>
-    </w:p>
-    <w:p>
-      <w:pPr>
-        <w:rPr>
-          <w:rFonts w:ascii="微软雅黑" w:eastAsia="微软雅黑" w:hAnsi="微软雅黑"/>
-          <w:lang w:eastAsia="zh-CN"/>
-        </w:rPr>
-      </w:pPr>
-      <w:r>
-        <w:rPr>
-          <w:rFonts w:ascii="微软雅黑" w:eastAsia="微软雅黑" w:hAnsi="微软雅黑"/>
-          <w:lang w:eastAsia="zh-CN"/>
-        </w:rPr>
-        <w:t>2. 会议操作系统（产品能力层）</w:t>
-      </w:r>
-    </w:p>
-    <w:p>
-      <w:pPr>
-        <w:rPr>
-          <w:rFonts w:ascii="微软雅黑" w:eastAsia="微软雅黑" w:hAnsi="微软雅黑"/>
-          <w:lang w:eastAsia="zh-CN"/>
-        </w:rPr>
-      </w:pPr>
-      <w:r>
-        <w:rPr>
-          <w:rFonts w:ascii="微软雅黑" w:eastAsia="微软雅黑" w:hAnsi="微软雅黑"/>
-          <w:lang w:eastAsia="zh-CN"/>
-        </w:rPr>
-        <w:t>3. 软件需求持续累积引擎(技术本质层)</w:t>
-      </w:r>
-    </w:p>
-    <w:p>
-      <w:pPr>
-        <w:rPr>
-          <w:rFonts w:ascii="微软雅黑" w:eastAsia="微软雅黑" w:hAnsi="微软雅黑"/>
-          <w:lang w:eastAsia="zh-CN"/>
-        </w:rPr>
-      </w:pPr>
-    </w:p>
-    <w:p>
-      <w:pPr>
-        <w:rPr>
-          <w:rFonts w:ascii="微软雅黑" w:eastAsia="微软雅黑" w:hAnsi="微软雅黑"/>
-          <w:lang w:eastAsia="zh-CN"/>
-        </w:rPr>
-      </w:pPr>
-      <w:r>
-        <w:rPr>
-          <w:rFonts w:ascii="微软雅黑" w:eastAsia="微软雅黑" w:hAnsi="微软雅黑"/>
-          <w:lang w:eastAsia="zh-CN"/>
-        </w:rPr>
-        <w:t>三、系统结构</w:t>
-      </w:r>
-    </w:p>
-    <w:p>
-      <w:pPr>
-        <w:rPr>
-          <w:rFonts w:ascii="微软雅黑" w:eastAsia="微软雅黑" w:hAnsi="微软雅黑"/>
-          <w:lang w:eastAsia="zh-CN"/>
-        </w:rPr>
-      </w:pPr>
-      <w:proofErr w:type="spellStart"/>
-      <w:r>
-        <w:rPr>
-          <w:rFonts w:ascii="微软雅黑" w:eastAsia="微软雅黑" w:hAnsi="微软雅黑"/>
-          <w:lang w:eastAsia="zh-CN"/>
-        </w:rPr>
-        <w:t>VPBuddy</w:t>
-      </w:r>
-      <w:proofErr w:type="spellEnd"/>
-      <w:r>
-        <w:rPr>
-          <w:rFonts w:ascii="微软雅黑" w:eastAsia="微软雅黑" w:hAnsi="微软雅黑"/>
-          <w:lang w:eastAsia="zh-CN"/>
-        </w:rPr>
-        <w:t>由五大系统组成：</w:t>
-      </w:r>
-    </w:p>
-    <w:p>
-      <w:pPr>
-        <w:rPr>
-          <w:rFonts w:ascii="微软雅黑" w:eastAsia="微软雅黑" w:hAnsi="微软雅黑"/>
-        </w:rPr>
-      </w:pPr>
-      <w:r>
-        <w:rPr>
-          <w:rFonts w:ascii="微软雅黑" w:eastAsia="微软雅黑" w:hAnsi="微软雅黑"/>
-        </w:rPr>
-        <w:t xml:space="preserve">1. </w:t>
-      </w:r>
-      <w:proofErr w:type="spellStart"/>
-      <w:r>
-        <w:rPr>
-          <w:rFonts w:ascii="微软雅黑" w:eastAsia="微软雅黑" w:hAnsi="微软雅黑"/>
-        </w:rPr>
-        <w:t>会议接入层（Join</w:t>
-      </w:r>
-      <w:proofErr w:type="spellEnd"/>
-      <w:r>
-        <w:rPr>
-          <w:rFonts w:ascii="微软雅黑" w:eastAsia="微软雅黑" w:hAnsi="微软雅黑"/>
         </w:rPr>
         <w:t xml:space="preserve"> Meeting）</w:t>
       </w:r>
@@ -603,11 +574,7 @@
         </w:rPr>
       </w:pPr>
       <w:r>
-        <w:rPr>
-          <w:rFonts w:ascii="微软雅黑" w:eastAsia="微软雅黑" w:hAnsi="微软雅黑"/>
-          <w:lang w:eastAsia="zh-CN"/>
-        </w:rPr>
-        <w:t>功能:会议入口与系统初始化;**v1.11 重大简化:默认用会议平台原生 ASR/转写**(带说话人识别,飞书妙记/腾讯 AI/Zoom AI Companion/钉钉智能会议都已支持),VPBuddy 不自实现 ASR</w:t>
+        <w:t>功能:会议入口与系统初始化;**v1.12 双轨 ASR**:**第一方案默认**(MVP 推荐)= 自接音频流 + Whisper + pyannote;**第二方案** Zoom RTMS(英文);**第三方案** 小鱼易连企业版 API(需 VPBuddy 签企业合作);**飞书妙记降为会后校准源**(跟 pyannote 融合提准确率)。VP 设备硬约束:必须用桌面客户端 + 授权麦克风/系统音频</w:t>
       </w:r>
     </w:p>
     <w:p>
@@ -663,11 +630,7 @@
         </w:rPr>
       </w:pPr>
       <w:r>
-        <w:rPr>
-          <w:rFonts w:ascii="微软雅黑" w:eastAsia="微软雅黑" w:hAnsi="微软雅黑"/>
-          <w:lang w:eastAsia="zh-CN"/>
-        </w:rPr>
-        <w:t>- 初始化平台原生 ASR/转写通道(带说话人识别;**v1.11 新增**)</w:t>
+        <w:t>- 初始化 ASR 通道(v1.12 双轨,默认 Whisper 自接:VP 设备 loopback + 服务端 faster-whisper + pyannote 说话人;可选 Zoom RTMS / 小鱼易连)</w:t>
       </w:r>
     </w:p>
     <w:p>
@@ -708,11 +671,7 @@
         </w:rPr>
       </w:pPr>
       <w:r>
-        <w:rPr>
-          <w:rFonts w:ascii="微软雅黑" w:eastAsia="微软雅黑" w:hAnsi="微软雅黑"/>
-          <w:lang w:eastAsia="zh-CN"/>
-        </w:rPr>
-        <w:t>- 创建会议工作台 + 启动后台 3 轨(累积/生成/疑问+预准备)</w:t>
+        <w:t>- 创建会议工作台 + 启动后台 3 轨(累积/生成/疑问+预准备);**v1.12** + 飞书妙记会后 Webhook → 跨源融合补全 speaker_name</w:t>
       </w:r>
     </w:p>
     <w:p>
@@ -746,11 +705,7 @@
         </w:rPr>
       </w:pPr>
       <w:r>
-        <w:rPr>
-          <w:rFonts w:ascii="微软雅黑" w:eastAsia="微软雅黑" w:hAnsi="微软雅黑"/>
-          <w:lang w:eastAsia="zh-CN"/>
-        </w:rPr>
-        <w:t>会议持续累积结构化为(后台,无延迟约束;**来源:v1.11 起改用平台原生 ASR/转写,带说话人标签**):</w:t>
+        <w:t>会议持续累积结构化为(后台,无延迟约束;**来源:v1.12 双轨 ASR —— 实时段来自 Whisper + pyannote(80-90% 说话人识别),会后段来自飞书妙记 REST(95%+ 平台原生说话人昵称),VPBuddy 内部跨源融合**):</w:t>
       </w:r>
     </w:p>
     <w:p>
@@ -2186,6 +2141,77 @@
     <w:p>
       <w:r>
         <w:t>VP 任何时候投屏/外发(无『完成』前提)</w:t>
+      </w:r>
+    </w:p>
+    <w:p/>
+    <w:p>
+      <w:r>
+        <w:t>十二、版本历史</w:t>
+      </w:r>
+    </w:p>
+    <w:p>
+      <w:r>
+        <w:t>- v1.0: 初版</w:t>
+      </w:r>
+    </w:p>
+    <w:p>
+      <w:r>
+        <w:t>- v1.1: 去"实时"</w:t>
+      </w:r>
+    </w:p>
+    <w:p>
+      <w:r>
+        <w:t>- v1.2: 后台并行生成</w:t>
+      </w:r>
+    </w:p>
+    <w:p>
+      <w:r>
+        <w:t>- v1.3: 知识库双模式</w:t>
+      </w:r>
+    </w:p>
+    <w:p>
+      <w:r>
+        <w:t>- v1.4: 展示不注入 prompt</w:t>
+      </w:r>
+    </w:p>
+    <w:p>
+      <w:r>
+        <w:t>- v1.5: Steer 控制层</w:t>
+      </w:r>
+    </w:p>
+    <w:p>
+      <w:r>
+        <w:t>- v1.6: Hermes-native + 可选生产</w:t>
+      </w:r>
+    </w:p>
+    <w:p>
+      <w:r>
+        <w:t>- v1.7: 投屏 = 会议原生</w:t>
+      </w:r>
+    </w:p>
+    <w:p>
+      <w:r>
+        <w:t>- v1.8: 回退 session 生命周期(YAGNI)</w:t>
+      </w:r>
+    </w:p>
+    <w:p>
+      <w:r>
+        <w:t>- v1.9: VPBuddy 连投屏按钮都不提供</w:t>
+      </w:r>
+    </w:p>
+    <w:p>
+      <w:r>
+        <w:t>- v1.10: 疑问窗口 + 预准备内容</w:t>
+      </w:r>
+    </w:p>
+    <w:p>
+      <w:r>
+        <w:t>- v1.11: 重大简化 — 默认用平台原生 ASR/转写</w:t>
+      </w:r>
+    </w:p>
+    <w:p>
+      <w:r>
+        <w:t>- **v1.12 (2026-06-20): 双轨 ASR** — 第一方案默认 Whisper 自接 + pyannote(VP 设备 loopback + 服务端 faster-whisper);第二方案 Zoom RTMS(英文);第三方案 小鱼易连企业版 API(需 VPBuddy 签企业合作);飞书妙记降为"会后校准源";VPBuddy 内部跨源融合补全 speaker_name;新增 VP 设备硬约束(必须桌面客户端);详细调研见 docs/research/asr-speaker-diarization-survey.md</w:t>
       </w:r>
     </w:p>
     <w:sectPr>

</xml_diff>